<commit_message>
[2026.04.30 hwan] update release deliverables
</commit_message>
<xml_diff>
--- a/logmile_deliverable/straffic/주간보고/[KDT] 인천부평_3기_3조_1주차_주간보고서.docx
+++ b/logmile_deliverable/straffic/주간보고/[KDT] 인천부평_3기_3조_1주차_주간보고서.docx
@@ -1,6 +1,6 @@
 
 <file path=word/document.xml><?xml version="1.0" encoding="utf-8"?>
-<w:document xmlns:wpc="http://schemas.microsoft.com/office/word/2010/wordprocessingCanvas" xmlns:cx="http://schemas.microsoft.com/office/drawing/2014/chartex" xmlns:cx1="http://schemas.microsoft.com/office/drawing/2015/9/8/chartex" xmlns:cx2="http://schemas.microsoft.com/office/drawing/2015/10/21/chartex" xmlns:cx3="http://schemas.microsoft.com/office/drawing/2016/5/9/chartex" xmlns:cx4="http://schemas.microsoft.com/office/drawing/2016/5/10/chartex" xmlns:cx5="http://schemas.microsoft.com/office/drawing/2016/5/11/chartex" xmlns:cx6="http://schemas.microsoft.com/office/drawing/2016/5/12/chartex" xmlns:cx7="http://schemas.microsoft.com/office/drawing/2016/5/13/chartex" xmlns:cx8="http://schemas.microsoft.com/office/drawing/2016/5/14/chartex" xmlns:mc="http://schemas.openxmlformats.org/markup-compatibility/2006" xmlns:aink="http://schemas.microsoft.com/office/drawing/2016/ink" xmlns:am3d="http://schemas.microsoft.com/office/drawing/2017/model3d" xmlns:o="urn:schemas-microsoft-com:office:office" xmlns:oel="http://schemas.microsoft.com/office/2019/extlst" xmlns:r="http://schemas.openxmlformats.org/officeDocument/2006/relationships" xmlns:m="http://schemas.openxmlformats.org/officeDocument/2006/math" xmlns:v="urn:schemas-microsoft-com:vml" xmlns:wp14="http://schemas.microsoft.com/office/word/2010/wordprocessingDrawing" xmlns:wp="http://schemas.openxmlformats.org/drawingml/2006/wordprocessingDrawing" xmlns:w10="urn:schemas-microsoft-com:office:word" xmlns:w="http://schemas.openxmlformats.org/wordprocessingml/2006/main" xmlns:w14="http://schemas.microsoft.com/office/word/2010/wordml" xmlns:w15="http://schemas.microsoft.com/office/word/2012/wordml" xmlns:w16cex="http://schemas.microsoft.com/office/word/2018/wordml/cex" xmlns:w16cid="http://schemas.microsoft.com/office/word/2016/wordml/cid" xmlns:w16="http://schemas.microsoft.com/office/word/2018/wordml" xmlns:w16sdtdh="http://schemas.microsoft.com/office/word/2020/wordml/sdtdatahash" xmlns:w16se="http://schemas.microsoft.com/office/word/2015/wordml/symex" xmlns:wpg="http://schemas.microsoft.com/office/word/2010/wordprocessingGroup" xmlns:wpi="http://schemas.microsoft.com/office/word/2010/wordprocessingInk" xmlns:wne="http://schemas.microsoft.com/office/word/2006/wordml" xmlns:wps="http://schemas.microsoft.com/office/word/2010/wordprocessingShape" mc:Ignorable="w14 w15 w16se w16cid w16 w16cex w16sdtdh wp14">
+<w:document xmlns:wpc="http://schemas.microsoft.com/office/word/2010/wordprocessingCanvas" xmlns:cx="http://schemas.microsoft.com/office/drawing/2014/chartex" xmlns:cx1="http://schemas.microsoft.com/office/drawing/2015/9/8/chartex" xmlns:cx2="http://schemas.microsoft.com/office/drawing/2015/10/21/chartex" xmlns:cx3="http://schemas.microsoft.com/office/drawing/2016/5/9/chartex" xmlns:cx4="http://schemas.microsoft.com/office/drawing/2016/5/10/chartex" xmlns:cx5="http://schemas.microsoft.com/office/drawing/2016/5/11/chartex" xmlns:cx6="http://schemas.microsoft.com/office/drawing/2016/5/12/chartex" xmlns:cx7="http://schemas.microsoft.com/office/drawing/2016/5/13/chartex" xmlns:cx8="http://schemas.microsoft.com/office/drawing/2016/5/14/chartex" xmlns:mc="http://schemas.openxmlformats.org/markup-compatibility/2006" xmlns:aink="http://schemas.microsoft.com/office/drawing/2016/ink" xmlns:am3d="http://schemas.microsoft.com/office/drawing/2017/model3d" xmlns:o="urn:schemas-microsoft-com:office:office" xmlns:oel="http://schemas.microsoft.com/office/2019/extlst" xmlns:r="http://schemas.openxmlformats.org/officeDocument/2006/relationships" xmlns:m="http://schemas.openxmlformats.org/officeDocument/2006/math" xmlns:v="urn:schemas-microsoft-com:vml" xmlns:wp14="http://schemas.microsoft.com/office/word/2010/wordprocessingDrawing" xmlns:wp="http://schemas.openxmlformats.org/drawingml/2006/wordprocessingDrawing" xmlns:w10="urn:schemas-microsoft-com:office:word" xmlns:w="http://schemas.openxmlformats.org/wordprocessingml/2006/main" xmlns:w14="http://schemas.microsoft.com/office/word/2010/wordml" xmlns:w15="http://schemas.microsoft.com/office/word/2012/wordml" xmlns:w16cex="http://schemas.microsoft.com/office/word/2018/wordml/cex" xmlns:w16cid="http://schemas.microsoft.com/office/word/2016/wordml/cid" xmlns:w16="http://schemas.microsoft.com/office/word/2018/wordml" xmlns:w16du="http://schemas.microsoft.com/office/word/2023/wordml/word16du" xmlns:w16sdtdh="http://schemas.microsoft.com/office/word/2020/wordml/sdtdatahash" xmlns:w16se="http://schemas.microsoft.com/office/word/2015/wordml/symex" xmlns:wpg="http://schemas.microsoft.com/office/word/2010/wordprocessingGroup" xmlns:wpi="http://schemas.microsoft.com/office/word/2010/wordprocessingInk" xmlns:wne="http://schemas.microsoft.com/office/word/2006/wordml" xmlns:wps="http://schemas.microsoft.com/office/word/2010/wordprocessingShape" mc:Ignorable="w14 w15 w16se w16cid w16 w16cex w16sdtdh wp14">
   <w:body>
     <w:p>
       <w:pPr>
@@ -128,29 +128,7 @@
           <w:sz w:val="20"/>
           <w:szCs w:val="20"/>
         </w:rPr>
-        <w:t xml:space="preserve">스마트 </w:t>
-      </w:r>
-      <w:proofErr w:type="spellStart"/>
-      <w:r>
-        <w:rPr>
-          <w:rFonts w:hint="eastAsia"/>
-          <w:b/>
-          <w:bCs/>
-          <w:sz w:val="20"/>
-          <w:szCs w:val="20"/>
-        </w:rPr>
-        <w:t>모빌리티</w:t>
-      </w:r>
-      <w:proofErr w:type="spellEnd"/>
-      <w:r>
-        <w:rPr>
-          <w:rFonts w:hint="eastAsia"/>
-          <w:b/>
-          <w:bCs/>
-          <w:sz w:val="20"/>
-          <w:szCs w:val="20"/>
-        </w:rPr>
-        <w:t xml:space="preserve"> DX 프로젝트</w:t>
+        <w:t>스마트 모빌리티 DX 프로젝트</w:t>
       </w:r>
       <w:r>
         <w:rPr>
@@ -169,7 +147,35 @@
           <w:sz w:val="20"/>
           <w:szCs w:val="20"/>
         </w:rPr>
-        <w:t xml:space="preserve"> 차량번호 인식 시스템 설계</w:t>
+        <w:t xml:space="preserve"> </w:t>
+      </w:r>
+      <w:r>
+        <w:rPr>
+          <w:rFonts w:hint="eastAsia"/>
+          <w:b/>
+          <w:bCs/>
+          <w:sz w:val="20"/>
+          <w:szCs w:val="20"/>
+        </w:rPr>
+        <w:t>화물차</w:t>
+      </w:r>
+      <w:r>
+        <w:rPr>
+          <w:b/>
+          <w:bCs/>
+          <w:sz w:val="20"/>
+          <w:szCs w:val="20"/>
+        </w:rPr>
+        <w:t xml:space="preserve"> 운전자 피로도 실시간 모니터링 시스템 설계</w:t>
+      </w:r>
+      <w:r>
+        <w:rPr>
+          <w:b/>
+          <w:bCs/>
+          <w:sz w:val="20"/>
+          <w:szCs w:val="20"/>
+        </w:rPr>
+        <w:t xml:space="preserve"> </w:t>
       </w:r>
       <w:r>
         <w:rPr>
@@ -344,7 +350,6 @@
         </w:rPr>
         <w:t xml:space="preserve">조, 팀장 </w:t>
       </w:r>
-      <w:proofErr w:type="spellStart"/>
       <w:r>
         <w:rPr>
           <w:rFonts w:hint="eastAsia"/>
@@ -355,7 +360,6 @@
         </w:rPr>
         <w:t>유환희</w:t>
       </w:r>
-      <w:proofErr w:type="spellEnd"/>
       <w:r>
         <w:rPr>
           <w:rFonts w:hint="eastAsia"/>
@@ -418,7 +422,6 @@
         <w:spacing w:after="0"/>
         <w:ind w:firstLineChars="100" w:firstLine="200"/>
         <w:rPr>
-          <w:rFonts w:hint="eastAsia"/>
           <w:sz w:val="20"/>
           <w:szCs w:val="20"/>
         </w:rPr>
@@ -446,7 +449,6 @@
         <w:spacing w:after="0"/>
         <w:ind w:firstLineChars="100" w:firstLine="200"/>
         <w:rPr>
-          <w:rFonts w:hint="eastAsia"/>
           <w:sz w:val="20"/>
           <w:szCs w:val="20"/>
         </w:rPr>
@@ -459,41 +461,13 @@
         </w:rPr>
         <w:t xml:space="preserve">     1) </w:t>
       </w:r>
-      <w:proofErr w:type="spellStart"/>
-      <w:r>
-        <w:rPr>
-          <w:rFonts w:hint="eastAsia"/>
-          <w:sz w:val="20"/>
-          <w:szCs w:val="20"/>
-        </w:rPr>
-        <w:t>거점지</w:t>
-      </w:r>
-      <w:proofErr w:type="spellEnd"/>
-      <w:r>
-        <w:rPr>
-          <w:rFonts w:hint="eastAsia"/>
-          <w:sz w:val="20"/>
-          <w:szCs w:val="20"/>
-        </w:rPr>
-        <w:t xml:space="preserve">(센터)에서 </w:t>
-      </w:r>
-      <w:proofErr w:type="spellStart"/>
-      <w:r>
-        <w:rPr>
-          <w:rFonts w:hint="eastAsia"/>
-          <w:sz w:val="20"/>
-          <w:szCs w:val="20"/>
-        </w:rPr>
-        <w:t>출도착</w:t>
-      </w:r>
-      <w:proofErr w:type="spellEnd"/>
-      <w:r>
-        <w:rPr>
-          <w:rFonts w:hint="eastAsia"/>
-          <w:sz w:val="20"/>
-          <w:szCs w:val="20"/>
-        </w:rPr>
-        <w:t xml:space="preserve"> 시 번호판을 읽어 운행시간 판별</w:t>
+      <w:r>
+        <w:rPr>
+          <w:rFonts w:hint="eastAsia"/>
+          <w:sz w:val="20"/>
+          <w:szCs w:val="20"/>
+        </w:rPr>
+        <w:t>거점지(센터)에서 출도착 시 번호판을 읽어 운행시간 판별</w:t>
       </w:r>
     </w:p>
     <w:p>
@@ -502,7 +476,6 @@
         <w:spacing w:after="0"/>
         <w:ind w:firstLineChars="100" w:firstLine="200"/>
         <w:rPr>
-          <w:rFonts w:hint="eastAsia"/>
           <w:sz w:val="20"/>
           <w:szCs w:val="20"/>
         </w:rPr>
@@ -606,36 +579,17 @@
         <w:spacing w:after="0"/>
         <w:ind w:firstLineChars="100" w:firstLine="200"/>
         <w:rPr>
-          <w:rFonts w:hint="eastAsia"/>
-          <w:sz w:val="20"/>
-          <w:szCs w:val="20"/>
-        </w:rPr>
-      </w:pPr>
-      <w:r>
-        <w:rPr>
-          <w:rFonts w:hint="eastAsia"/>
-          <w:sz w:val="20"/>
-          <w:szCs w:val="20"/>
-        </w:rPr>
-        <w:t xml:space="preserve">   ∙ 협업 : git, </w:t>
-      </w:r>
-      <w:proofErr w:type="spellStart"/>
-      <w:r>
-        <w:rPr>
-          <w:rFonts w:hint="eastAsia"/>
-          <w:sz w:val="20"/>
-          <w:szCs w:val="20"/>
-        </w:rPr>
-        <w:t>github</w:t>
-      </w:r>
-      <w:proofErr w:type="spellEnd"/>
-      <w:r>
-        <w:rPr>
-          <w:rFonts w:hint="eastAsia"/>
-          <w:sz w:val="20"/>
-          <w:szCs w:val="20"/>
-        </w:rPr>
-        <w:t xml:space="preserve">, notion, </w:t>
+          <w:sz w:val="20"/>
+          <w:szCs w:val="20"/>
+        </w:rPr>
+      </w:pPr>
+      <w:r>
+        <w:rPr>
+          <w:rFonts w:hint="eastAsia"/>
+          <w:sz w:val="20"/>
+          <w:szCs w:val="20"/>
+        </w:rPr>
+        <w:t xml:space="preserve">   ∙ 협업 : git, github, notion, </w:t>
       </w:r>
       <w:r>
         <w:rPr>
@@ -669,25 +623,7 @@
           <w:sz w:val="20"/>
           <w:szCs w:val="20"/>
         </w:rPr>
-        <w:t xml:space="preserve">   ∙ </w:t>
-      </w:r>
-      <w:proofErr w:type="spellStart"/>
-      <w:r>
-        <w:rPr>
-          <w:rFonts w:hint="eastAsia"/>
-          <w:sz w:val="20"/>
-          <w:szCs w:val="20"/>
-        </w:rPr>
-        <w:t>백엔드</w:t>
-      </w:r>
-      <w:proofErr w:type="spellEnd"/>
-      <w:r>
-        <w:rPr>
-          <w:rFonts w:hint="eastAsia"/>
-          <w:sz w:val="20"/>
-          <w:szCs w:val="20"/>
-        </w:rPr>
-        <w:t xml:space="preserve"> 프레임워크 : Spring boot</w:t>
+        <w:t xml:space="preserve">   ∙ 백엔드 프레임워크 : Spring boot</w:t>
       </w:r>
     </w:p>
     <w:p>
@@ -706,52 +642,94 @@
           <w:sz w:val="20"/>
           <w:szCs w:val="20"/>
         </w:rPr>
-        <w:t xml:space="preserve">   ∙ </w:t>
-      </w:r>
-      <w:proofErr w:type="spellStart"/>
-      <w:r>
-        <w:rPr>
-          <w:rFonts w:hint="eastAsia"/>
-          <w:sz w:val="20"/>
-          <w:szCs w:val="20"/>
-        </w:rPr>
-        <w:t>프론트엔드</w:t>
-      </w:r>
-      <w:proofErr w:type="spellEnd"/>
-      <w:r>
-        <w:rPr>
-          <w:rFonts w:hint="eastAsia"/>
-          <w:sz w:val="20"/>
-          <w:szCs w:val="20"/>
-        </w:rPr>
-        <w:t xml:space="preserve"> 프레임워크 : node.js, vue.js, chart.js, vs code, </w:t>
-      </w:r>
-      <w:proofErr w:type="spellStart"/>
-      <w:r>
-        <w:rPr>
-          <w:rFonts w:hint="eastAsia"/>
-          <w:sz w:val="20"/>
-          <w:szCs w:val="20"/>
-        </w:rPr>
-        <w:t>pinia</w:t>
-      </w:r>
-      <w:proofErr w:type="spellEnd"/>
-      <w:r>
-        <w:rPr>
+        <w:t xml:space="preserve">   ∙ 프론트엔드 프레임워크 : node.js, vue.js, chart.js, vs code, pinia</w:t>
+      </w:r>
+      <w:r>
+        <w:rPr>
+          <w:sz w:val="20"/>
+          <w:szCs w:val="20"/>
+        </w:rPr>
+        <w:t>, Axios</w:t>
+      </w:r>
+    </w:p>
+    <w:p>
+      <w:pPr>
+        <w:wordWrap/>
+        <w:spacing w:after="0"/>
+        <w:ind w:firstLineChars="100" w:firstLine="200"/>
+        <w:rPr>
+          <w:sz w:val="20"/>
+          <w:szCs w:val="20"/>
+        </w:rPr>
+      </w:pPr>
+      <w:r>
+        <w:rPr>
+          <w:rFonts w:hint="eastAsia"/>
+          <w:sz w:val="20"/>
+          <w:szCs w:val="20"/>
+        </w:rPr>
+        <w:t xml:space="preserve">   ∙ 인공지능(AI) / 머신러닝(ML) : </w:t>
+      </w:r>
+      <w:r>
+        <w:rPr>
+          <w:sz w:val="20"/>
+          <w:szCs w:val="20"/>
+        </w:rPr>
+        <w:t>YOLO8</w:t>
+      </w:r>
+      <w:r>
+        <w:rPr>
+          <w:rFonts w:hint="eastAsia"/>
           <w:sz w:val="20"/>
           <w:szCs w:val="20"/>
         </w:rPr>
         <w:t xml:space="preserve">, </w:t>
       </w:r>
-      <w:proofErr w:type="spellStart"/>
-      <w:r>
-        <w:rPr>
-          <w:sz w:val="20"/>
-          <w:szCs w:val="20"/>
-        </w:rPr>
-        <w:t>Axios</w:t>
-      </w:r>
-      <w:proofErr w:type="spellEnd"/>
+      <w:r>
+        <w:rPr>
+          <w:sz w:val="20"/>
+          <w:szCs w:val="20"/>
+        </w:rPr>
+        <w:t>Opencv</w:t>
+      </w:r>
+      <w:r>
+        <w:rPr>
+          <w:rFonts w:hint="eastAsia"/>
+          <w:sz w:val="20"/>
+          <w:szCs w:val="20"/>
+        </w:rPr>
+        <w:t xml:space="preserve">, </w:t>
+      </w:r>
+      <w:r>
+        <w:rPr>
+          <w:sz w:val="20"/>
+          <w:szCs w:val="20"/>
+        </w:rPr>
+        <w:t>Easy</w:t>
+      </w:r>
+      <w:r>
+        <w:rPr>
+          <w:rFonts w:hint="eastAsia"/>
+          <w:sz w:val="20"/>
+          <w:szCs w:val="20"/>
+        </w:rPr>
+        <w:t>O</w:t>
+      </w:r>
+      <w:r>
+        <w:rPr>
+          <w:sz w:val="20"/>
+          <w:szCs w:val="20"/>
+        </w:rPr>
+        <w:t>CR</w:t>
+      </w:r>
+      <w:r>
+        <w:rPr>
+          <w:rFonts w:hint="eastAsia"/>
+          <w:sz w:val="20"/>
+          <w:szCs w:val="20"/>
+        </w:rPr>
+        <w:t>, python</w:t>
+      </w:r>
     </w:p>
     <w:p>
       <w:pPr>
@@ -769,32 +747,22 @@
           <w:sz w:val="20"/>
           <w:szCs w:val="20"/>
         </w:rPr>
-        <w:t xml:space="preserve">   ∙ 인공지능(AI) / </w:t>
-      </w:r>
-      <w:proofErr w:type="spellStart"/>
-      <w:r>
-        <w:rPr>
-          <w:rFonts w:hint="eastAsia"/>
-          <w:sz w:val="20"/>
-          <w:szCs w:val="20"/>
-        </w:rPr>
-        <w:t>머신러닝</w:t>
-      </w:r>
-      <w:proofErr w:type="spellEnd"/>
-      <w:r>
-        <w:rPr>
-          <w:rFonts w:hint="eastAsia"/>
-          <w:sz w:val="20"/>
-          <w:szCs w:val="20"/>
-        </w:rPr>
-        <w:t xml:space="preserve">(ML) : </w:t>
-      </w:r>
-      <w:r>
-        <w:rPr>
-          <w:sz w:val="20"/>
-          <w:szCs w:val="20"/>
-        </w:rPr>
-        <w:t>YOLO8</w:t>
+        <w:t xml:space="preserve">   ∙ 인공지능(AI) 어시스턴트 : </w:t>
+      </w:r>
+      <w:r>
+        <w:rPr>
+          <w:rFonts w:hint="eastAsia"/>
+          <w:sz w:val="20"/>
+          <w:szCs w:val="20"/>
+        </w:rPr>
+        <w:t>G</w:t>
+      </w:r>
+      <w:r>
+        <w:rPr>
+          <w:sz w:val="20"/>
+          <w:szCs w:val="20"/>
+        </w:rPr>
+        <w:t>emini</w:t>
       </w:r>
       <w:r>
         <w:rPr>
@@ -804,15 +772,13 @@
         </w:rPr>
         <w:t xml:space="preserve">, </w:t>
       </w:r>
-      <w:proofErr w:type="spellStart"/>
-      <w:r>
-        <w:rPr>
-          <w:sz w:val="20"/>
-          <w:szCs w:val="20"/>
-        </w:rPr>
-        <w:t>Opencv</w:t>
-      </w:r>
-      <w:proofErr w:type="spellEnd"/>
+      <w:r>
+        <w:rPr>
+          <w:sz w:val="20"/>
+          <w:szCs w:val="20"/>
+        </w:rPr>
+        <w:t>Claude</w:t>
+      </w:r>
       <w:r>
         <w:rPr>
           <w:rFonts w:hint="eastAsia"/>
@@ -821,37 +787,12 @@
         </w:rPr>
         <w:t xml:space="preserve">, </w:t>
       </w:r>
-      <w:proofErr w:type="spellStart"/>
-      <w:r>
-        <w:rPr>
-          <w:sz w:val="20"/>
-          <w:szCs w:val="20"/>
-        </w:rPr>
-        <w:t>Easy</w:t>
-      </w:r>
-      <w:r>
-        <w:rPr>
-          <w:rFonts w:hint="eastAsia"/>
-          <w:sz w:val="20"/>
-          <w:szCs w:val="20"/>
-        </w:rPr>
-        <w:t>O</w:t>
-      </w:r>
-      <w:r>
-        <w:rPr>
-          <w:sz w:val="20"/>
-          <w:szCs w:val="20"/>
-        </w:rPr>
-        <w:t>CR</w:t>
-      </w:r>
-      <w:proofErr w:type="spellEnd"/>
-      <w:r>
-        <w:rPr>
-          <w:rFonts w:hint="eastAsia"/>
-          <w:sz w:val="20"/>
-          <w:szCs w:val="20"/>
-        </w:rPr>
-        <w:t>, python</w:t>
+      <w:r>
+        <w:rPr>
+          <w:sz w:val="20"/>
+          <w:szCs w:val="20"/>
+        </w:rPr>
+        <w:t>Codex</w:t>
       </w:r>
     </w:p>
     <w:p>
@@ -860,62 +801,21 @@
         <w:spacing w:after="0"/>
         <w:ind w:firstLineChars="100" w:firstLine="200"/>
         <w:rPr>
-          <w:sz w:val="20"/>
-          <w:szCs w:val="20"/>
-        </w:rPr>
-      </w:pPr>
-      <w:r>
-        <w:rPr>
-          <w:rFonts w:hint="eastAsia"/>
-          <w:sz w:val="20"/>
-          <w:szCs w:val="20"/>
-        </w:rPr>
-        <w:t xml:space="preserve">   ∙ 인공지능(AI) 어시스턴트 : </w:t>
-      </w:r>
-      <w:r>
-        <w:rPr>
-          <w:rFonts w:hint="eastAsia"/>
-          <w:sz w:val="20"/>
-          <w:szCs w:val="20"/>
-        </w:rPr>
-        <w:t>G</w:t>
-      </w:r>
-      <w:r>
-        <w:rPr>
-          <w:sz w:val="20"/>
-          <w:szCs w:val="20"/>
-        </w:rPr>
-        <w:t>emini</w:t>
-      </w:r>
-      <w:r>
-        <w:rPr>
-          <w:rFonts w:hint="eastAsia"/>
-          <w:sz w:val="20"/>
-          <w:szCs w:val="20"/>
-        </w:rPr>
-        <w:t xml:space="preserve">, </w:t>
-      </w:r>
-      <w:r>
-        <w:rPr>
-          <w:sz w:val="20"/>
-          <w:szCs w:val="20"/>
-        </w:rPr>
-        <w:t>Claude</w:t>
-      </w:r>
-      <w:r>
-        <w:rPr>
-          <w:rFonts w:hint="eastAsia"/>
-          <w:sz w:val="20"/>
-          <w:szCs w:val="20"/>
-        </w:rPr>
-        <w:t xml:space="preserve">, </w:t>
-      </w:r>
-      <w:r>
-        <w:rPr>
-          <w:sz w:val="20"/>
-          <w:szCs w:val="20"/>
-        </w:rPr>
-        <w:t>Codex</w:t>
+          <w:b/>
+          <w:bCs/>
+          <w:sz w:val="20"/>
+          <w:szCs w:val="20"/>
+        </w:rPr>
+      </w:pPr>
+      <w:r>
+        <w:rPr>
+          <w:rFonts w:hint="eastAsia"/>
+          <w:b/>
+          <w:bCs/>
+          <w:sz w:val="20"/>
+          <w:szCs w:val="20"/>
+        </w:rPr>
+        <w:t xml:space="preserve">  - 개발 및 운영환경 설정</w:t>
       </w:r>
     </w:p>
     <w:p>
@@ -924,21 +824,32 @@
         <w:spacing w:after="0"/>
         <w:ind w:firstLineChars="100" w:firstLine="200"/>
         <w:rPr>
-          <w:b/>
-          <w:bCs/>
-          <w:sz w:val="20"/>
-          <w:szCs w:val="20"/>
-        </w:rPr>
-      </w:pPr>
-      <w:r>
-        <w:rPr>
-          <w:rFonts w:hint="eastAsia"/>
-          <w:b/>
-          <w:bCs/>
-          <w:sz w:val="20"/>
-          <w:szCs w:val="20"/>
-        </w:rPr>
-        <w:t xml:space="preserve">  - 개발 및 운영환경 설정</w:t>
+          <w:sz w:val="20"/>
+          <w:szCs w:val="20"/>
+        </w:rPr>
+      </w:pPr>
+      <w:r>
+        <w:rPr>
+          <w:rFonts w:hint="eastAsia"/>
+          <w:sz w:val="20"/>
+          <w:szCs w:val="20"/>
+        </w:rPr>
+        <w:t xml:space="preserve">   ∙ 클라우드 기반 환경 (window1</w:t>
+      </w:r>
+      <w:r>
+        <w:rPr>
+          <w:sz w:val="20"/>
+          <w:szCs w:val="20"/>
+        </w:rPr>
+        <w:t>1, Mac</w:t>
+      </w:r>
+      <w:r>
+        <w:rPr>
+          <w:rFonts w:hint="eastAsia"/>
+          <w:sz w:val="20"/>
+          <w:szCs w:val="20"/>
+        </w:rPr>
+        <w:t>, linux)</w:t>
       </w:r>
     </w:p>
     <w:p>
@@ -957,40 +868,14 @@
           <w:sz w:val="20"/>
           <w:szCs w:val="20"/>
         </w:rPr>
-        <w:t xml:space="preserve">   ∙ 클라우드 기반 환경 (window1</w:t>
-      </w:r>
-      <w:r>
-        <w:rPr>
-          <w:sz w:val="20"/>
-          <w:szCs w:val="20"/>
-        </w:rPr>
-        <w:t>1, Mac</w:t>
-      </w:r>
-      <w:r>
-        <w:rPr>
-          <w:rFonts w:hint="eastAsia"/>
-          <w:sz w:val="20"/>
-          <w:szCs w:val="20"/>
-        </w:rPr>
-        <w:t xml:space="preserve">, </w:t>
-      </w:r>
-      <w:proofErr w:type="spellStart"/>
-      <w:r>
-        <w:rPr>
-          <w:rFonts w:hint="eastAsia"/>
-          <w:sz w:val="20"/>
-          <w:szCs w:val="20"/>
-        </w:rPr>
-        <w:t>linux</w:t>
-      </w:r>
-      <w:proofErr w:type="spellEnd"/>
-      <w:r>
-        <w:rPr>
-          <w:rFonts w:hint="eastAsia"/>
-          <w:sz w:val="20"/>
-          <w:szCs w:val="20"/>
-        </w:rPr>
-        <w:t>)</w:t>
+        <w:t xml:space="preserve">    1) </w:t>
+      </w:r>
+      <w:r>
+        <w:rPr>
+          <w:sz w:val="20"/>
+          <w:szCs w:val="20"/>
+        </w:rPr>
+        <w:t>Docker, Docker-compose</w:t>
       </w:r>
     </w:p>
     <w:p>
@@ -1009,14 +894,7 @@
           <w:sz w:val="20"/>
           <w:szCs w:val="20"/>
         </w:rPr>
-        <w:t xml:space="preserve">    1) </w:t>
-      </w:r>
-      <w:r>
-        <w:rPr>
-          <w:sz w:val="20"/>
-          <w:szCs w:val="20"/>
-        </w:rPr>
-        <w:t>Docker, Docker-compose</w:t>
+        <w:t xml:space="preserve">    2-1) window11 - WSL2 + Docker Desktop 설치, JDK 21, IntelliJ IDEA (Spring Boot 백엔드), VS Code (Vue.js 프론트), Git, Python 3.11 (FastAPI/YOLOv8)</w:t>
       </w:r>
     </w:p>
     <w:p>
@@ -1031,37 +909,10 @@
       </w:pPr>
       <w:r>
         <w:rPr>
-          <w:rFonts w:hint="eastAsia"/>
-          <w:sz w:val="20"/>
-          <w:szCs w:val="20"/>
-        </w:rPr>
-        <w:t xml:space="preserve">    2-1) window11 - WSL2 + Docker Desktop 설치, JDK 21, IntelliJ IDEA (Spring Boot 백엔드), VS Code (Vue.js 프론트), Git, Python 3.11 (FastAPI/YOLOv8)</w:t>
-      </w:r>
-      <w:r>
-        <w:rPr>
-          <w:sz w:val="20"/>
-          <w:szCs w:val="20"/>
-        </w:rPr>
-      </w:r>
-      <w:r>
-        <w:rPr>
-          <w:rFonts w:hint="eastAsia"/>
-          <w:sz w:val="20"/>
-          <w:szCs w:val="20"/>
-        </w:rPr>
-      </w:r>
-      <w:r>
-        <w:rPr>
-          <w:sz w:val="20"/>
-          <w:szCs w:val="20"/>
-        </w:rPr>
-      </w:r>
-      <w:r>
-        <w:rPr>
-          <w:rFonts w:hint="eastAsia"/>
-          <w:sz w:val="20"/>
-          <w:szCs w:val="20"/>
-        </w:rPr>
+          <w:sz w:val="20"/>
+          <w:szCs w:val="20"/>
+        </w:rPr>
+        <w:t xml:space="preserve">    2-2) Mac - Docker Desktop 설치, JDK 21, IntelliJ IDEA (Spring Boot 백엔드), VS Code (Vue.js 프론트), Homebrew, Git, Python 3.11 (FastAPI/YOLOv8)</w:t>
       </w:r>
     </w:p>
     <w:p>
@@ -1070,51 +921,16 @@
         <w:spacing w:after="0"/>
         <w:ind w:firstLineChars="100" w:firstLine="200"/>
         <w:rPr>
-          <w:rFonts w:hint="eastAsia"/>
-          <w:sz w:val="20"/>
-          <w:szCs w:val="20"/>
-        </w:rPr>
-      </w:pPr>
-      <w:r>
-        <w:rPr>
-          <w:sz w:val="20"/>
-          <w:szCs w:val="20"/>
-        </w:rPr>
-        <w:t xml:space="preserve">    2-2) Mac - Docker Desktop 설치, JDK 21, IntelliJ IDEA (Spring Boot 백엔드), VS Code (Vue.js 프론트), Homebrew, Git, Python 3.11 (FastAPI/YOLOv8)</w:t>
-      </w:r>
-    </w:p>
-    <w:p>
-      <w:pPr>
-        <w:wordWrap/>
-        <w:spacing w:after="0"/>
-        <w:ind w:firstLineChars="100" w:firstLine="200"/>
-        <w:rPr>
-          <w:sz w:val="20"/>
-          <w:szCs w:val="20"/>
-        </w:rPr>
-      </w:pPr>
-      <w:r>
-        <w:rPr>
-          <w:sz w:val="20"/>
-          <w:szCs w:val="20"/>
-        </w:rPr>
-        <w:t xml:space="preserve">    3) </w:t>
-      </w:r>
-      <w:proofErr w:type="spellStart"/>
-      <w:r>
-        <w:rPr>
-          <w:sz w:val="20"/>
-          <w:szCs w:val="20"/>
-        </w:rPr>
-        <w:t>linux</w:t>
-      </w:r>
-      <w:proofErr w:type="spellEnd"/>
-      <w:r>
-        <w:rPr>
-          <w:sz w:val="20"/>
-          <w:szCs w:val="20"/>
-        </w:rPr>
-        <w:t xml:space="preserve">환경 배포 </w:t>
+          <w:sz w:val="20"/>
+          <w:szCs w:val="20"/>
+        </w:rPr>
+      </w:pPr>
+      <w:r>
+        <w:rPr>
+          <w:sz w:val="20"/>
+          <w:szCs w:val="20"/>
+        </w:rPr>
+        <w:t xml:space="preserve">    3) linux환경 배포 </w:t>
       </w:r>
       <w:r>
         <w:rPr>
@@ -1142,39 +958,7 @@
           <w:sz w:val="20"/>
           <w:szCs w:val="20"/>
         </w:rPr>
-        <w:t xml:space="preserve">/ai 최적화, 자동 보안 패치, </w:t>
-      </w:r>
-      <w:proofErr w:type="spellStart"/>
-      <w:r>
-        <w:rPr>
-          <w:sz w:val="20"/>
-          <w:szCs w:val="20"/>
-        </w:rPr>
-        <w:t>ssh</w:t>
-      </w:r>
-      <w:proofErr w:type="spellEnd"/>
-      <w:r>
-        <w:rPr>
-          <w:sz w:val="20"/>
-          <w:szCs w:val="20"/>
-        </w:rPr>
-        <w:t xml:space="preserve">키 + docker로 </w:t>
-      </w:r>
-      <w:proofErr w:type="spellStart"/>
-      <w:r>
-        <w:rPr>
-          <w:sz w:val="20"/>
-          <w:szCs w:val="20"/>
-        </w:rPr>
-        <w:t>핫픽스</w:t>
-      </w:r>
-      <w:proofErr w:type="spellEnd"/>
-      <w:r>
-        <w:rPr>
-          <w:sz w:val="20"/>
-          <w:szCs w:val="20"/>
-        </w:rPr>
-        <w:t xml:space="preserve"> 가능</w:t>
+        <w:t>/ai 최적화, 자동 보안 패치, ssh키 + docker로 핫픽스 가능</w:t>
       </w:r>
     </w:p>
     <w:p>
@@ -1535,7 +1319,6 @@
                 <w:szCs w:val="20"/>
               </w:rPr>
             </w:pPr>
-            <w:proofErr w:type="spellStart"/>
             <w:r>
               <w:rPr>
                 <w:rFonts w:hint="eastAsia"/>
@@ -1544,7 +1327,6 @@
               </w:rPr>
               <w:t>진척률</w:t>
             </w:r>
-            <w:proofErr w:type="spellEnd"/>
           </w:p>
         </w:tc>
         <w:tc>
@@ -1961,6 +1743,7 @@
                 <w:sz w:val="20"/>
                 <w:szCs w:val="20"/>
               </w:rPr>
+              <w:lastRenderedPageBreak/>
               <w:t>합계</w:t>
             </w:r>
           </w:p>
@@ -2061,7 +1844,6 @@
         <w:spacing w:after="0"/>
         <w:ind w:firstLineChars="100" w:firstLine="200"/>
         <w:rPr>
-          <w:rFonts w:hint="eastAsia"/>
           <w:sz w:val="20"/>
           <w:szCs w:val="20"/>
         </w:rPr>
@@ -2078,7 +1860,7 @@
 </file>
 
 <file path=word/endnotes.xml><?xml version="1.0" encoding="utf-8"?>
-<w:endnotes xmlns:wpc="http://schemas.microsoft.com/office/word/2010/wordprocessingCanvas" xmlns:cx="http://schemas.microsoft.com/office/drawing/2014/chartex" xmlns:cx1="http://schemas.microsoft.com/office/drawing/2015/9/8/chartex" xmlns:cx2="http://schemas.microsoft.com/office/drawing/2015/10/21/chartex" xmlns:cx3="http://schemas.microsoft.com/office/drawing/2016/5/9/chartex" xmlns:cx4="http://schemas.microsoft.com/office/drawing/2016/5/10/chartex" xmlns:cx5="http://schemas.microsoft.com/office/drawing/2016/5/11/chartex" xmlns:cx6="http://schemas.microsoft.com/office/drawing/2016/5/12/chartex" xmlns:cx7="http://schemas.microsoft.com/office/drawing/2016/5/13/chartex" xmlns:cx8="http://schemas.microsoft.com/office/drawing/2016/5/14/chartex" xmlns:mc="http://schemas.openxmlformats.org/markup-compatibility/2006" xmlns:aink="http://schemas.microsoft.com/office/drawing/2016/ink" xmlns:am3d="http://schemas.microsoft.com/office/drawing/2017/model3d" xmlns:o="urn:schemas-microsoft-com:office:office" xmlns:oel="http://schemas.microsoft.com/office/2019/extlst" xmlns:r="http://schemas.openxmlformats.org/officeDocument/2006/relationships" xmlns:m="http://schemas.openxmlformats.org/officeDocument/2006/math" xmlns:v="urn:schemas-microsoft-com:vml" xmlns:wp14="http://schemas.microsoft.com/office/word/2010/wordprocessingDrawing" xmlns:wp="http://schemas.openxmlformats.org/drawingml/2006/wordprocessingDrawing" xmlns:w10="urn:schemas-microsoft-com:office:word" xmlns:w="http://schemas.openxmlformats.org/wordprocessingml/2006/main" xmlns:w14="http://schemas.microsoft.com/office/word/2010/wordml" xmlns:w15="http://schemas.microsoft.com/office/word/2012/wordml" xmlns:w16cex="http://schemas.microsoft.com/office/word/2018/wordml/cex" xmlns:w16cid="http://schemas.microsoft.com/office/word/2016/wordml/cid" xmlns:w16="http://schemas.microsoft.com/office/word/2018/wordml" xmlns:w16sdtdh="http://schemas.microsoft.com/office/word/2020/wordml/sdtdatahash" xmlns:w16se="http://schemas.microsoft.com/office/word/2015/wordml/symex" xmlns:wpg="http://schemas.microsoft.com/office/word/2010/wordprocessingGroup" xmlns:wpi="http://schemas.microsoft.com/office/word/2010/wordprocessingInk" xmlns:wne="http://schemas.microsoft.com/office/word/2006/wordml" xmlns:wps="http://schemas.microsoft.com/office/word/2010/wordprocessingShape" mc:Ignorable="w14 w15 w16se w16cid w16 w16cex w16sdtdh wp14">
+<w:endnotes xmlns:wpc="http://schemas.microsoft.com/office/word/2010/wordprocessingCanvas" xmlns:cx="http://schemas.microsoft.com/office/drawing/2014/chartex" xmlns:cx1="http://schemas.microsoft.com/office/drawing/2015/9/8/chartex" xmlns:cx2="http://schemas.microsoft.com/office/drawing/2015/10/21/chartex" xmlns:cx3="http://schemas.microsoft.com/office/drawing/2016/5/9/chartex" xmlns:cx4="http://schemas.microsoft.com/office/drawing/2016/5/10/chartex" xmlns:cx5="http://schemas.microsoft.com/office/drawing/2016/5/11/chartex" xmlns:cx6="http://schemas.microsoft.com/office/drawing/2016/5/12/chartex" xmlns:cx7="http://schemas.microsoft.com/office/drawing/2016/5/13/chartex" xmlns:cx8="http://schemas.microsoft.com/office/drawing/2016/5/14/chartex" xmlns:mc="http://schemas.openxmlformats.org/markup-compatibility/2006" xmlns:aink="http://schemas.microsoft.com/office/drawing/2016/ink" xmlns:am3d="http://schemas.microsoft.com/office/drawing/2017/model3d" xmlns:o="urn:schemas-microsoft-com:office:office" xmlns:oel="http://schemas.microsoft.com/office/2019/extlst" xmlns:r="http://schemas.openxmlformats.org/officeDocument/2006/relationships" xmlns:m="http://schemas.openxmlformats.org/officeDocument/2006/math" xmlns:v="urn:schemas-microsoft-com:vml" xmlns:wp14="http://schemas.microsoft.com/office/word/2010/wordprocessingDrawing" xmlns:wp="http://schemas.openxmlformats.org/drawingml/2006/wordprocessingDrawing" xmlns:w10="urn:schemas-microsoft-com:office:word" xmlns:w="http://schemas.openxmlformats.org/wordprocessingml/2006/main" xmlns:w14="http://schemas.microsoft.com/office/word/2010/wordml" xmlns:w15="http://schemas.microsoft.com/office/word/2012/wordml" xmlns:w16cex="http://schemas.microsoft.com/office/word/2018/wordml/cex" xmlns:w16cid="http://schemas.microsoft.com/office/word/2016/wordml/cid" xmlns:w16="http://schemas.microsoft.com/office/word/2018/wordml" xmlns:w16du="http://schemas.microsoft.com/office/word/2023/wordml/word16du" xmlns:w16sdtdh="http://schemas.microsoft.com/office/word/2020/wordml/sdtdatahash" xmlns:w16se="http://schemas.microsoft.com/office/word/2015/wordml/symex" xmlns:wpg="http://schemas.microsoft.com/office/word/2010/wordprocessingGroup" xmlns:wpi="http://schemas.microsoft.com/office/word/2010/wordprocessingInk" xmlns:wne="http://schemas.microsoft.com/office/word/2006/wordml" xmlns:wps="http://schemas.microsoft.com/office/word/2010/wordprocessingShape" mc:Ignorable="w14 w15 w16se w16cid w16 w16cex w16sdtdh wp14">
   <w:endnote w:type="separator" w:id="-1">
     <w:p>
       <w:pPr>
@@ -2103,7 +1885,7 @@
 </file>
 
 <file path=word/footnotes.xml><?xml version="1.0" encoding="utf-8"?>
-<w:footnotes xmlns:wpc="http://schemas.microsoft.com/office/word/2010/wordprocessingCanvas" xmlns:cx="http://schemas.microsoft.com/office/drawing/2014/chartex" xmlns:cx1="http://schemas.microsoft.com/office/drawing/2015/9/8/chartex" xmlns:cx2="http://schemas.microsoft.com/office/drawing/2015/10/21/chartex" xmlns:cx3="http://schemas.microsoft.com/office/drawing/2016/5/9/chartex" xmlns:cx4="http://schemas.microsoft.com/office/drawing/2016/5/10/chartex" xmlns:cx5="http://schemas.microsoft.com/office/drawing/2016/5/11/chartex" xmlns:cx6="http://schemas.microsoft.com/office/drawing/2016/5/12/chartex" xmlns:cx7="http://schemas.microsoft.com/office/drawing/2016/5/13/chartex" xmlns:cx8="http://schemas.microsoft.com/office/drawing/2016/5/14/chartex" xmlns:mc="http://schemas.openxmlformats.org/markup-compatibility/2006" xmlns:aink="http://schemas.microsoft.com/office/drawing/2016/ink" xmlns:am3d="http://schemas.microsoft.com/office/drawing/2017/model3d" xmlns:o="urn:schemas-microsoft-com:office:office" xmlns:oel="http://schemas.microsoft.com/office/2019/extlst" xmlns:r="http://schemas.openxmlformats.org/officeDocument/2006/relationships" xmlns:m="http://schemas.openxmlformats.org/officeDocument/2006/math" xmlns:v="urn:schemas-microsoft-com:vml" xmlns:wp14="http://schemas.microsoft.com/office/word/2010/wordprocessingDrawing" xmlns:wp="http://schemas.openxmlformats.org/drawingml/2006/wordprocessingDrawing" xmlns:w10="urn:schemas-microsoft-com:office:word" xmlns:w="http://schemas.openxmlformats.org/wordprocessingml/2006/main" xmlns:w14="http://schemas.microsoft.com/office/word/2010/wordml" xmlns:w15="http://schemas.microsoft.com/office/word/2012/wordml" xmlns:w16cex="http://schemas.microsoft.com/office/word/2018/wordml/cex" xmlns:w16cid="http://schemas.microsoft.com/office/word/2016/wordml/cid" xmlns:w16="http://schemas.microsoft.com/office/word/2018/wordml" xmlns:w16sdtdh="http://schemas.microsoft.com/office/word/2020/wordml/sdtdatahash" xmlns:w16se="http://schemas.microsoft.com/office/word/2015/wordml/symex" xmlns:wpg="http://schemas.microsoft.com/office/word/2010/wordprocessingGroup" xmlns:wpi="http://schemas.microsoft.com/office/word/2010/wordprocessingInk" xmlns:wne="http://schemas.microsoft.com/office/word/2006/wordml" xmlns:wps="http://schemas.microsoft.com/office/word/2010/wordprocessingShape" mc:Ignorable="w14 w15 w16se w16cid w16 w16cex w16sdtdh wp14">
+<w:footnotes xmlns:wpc="http://schemas.microsoft.com/office/word/2010/wordprocessingCanvas" xmlns:cx="http://schemas.microsoft.com/office/drawing/2014/chartex" xmlns:cx1="http://schemas.microsoft.com/office/drawing/2015/9/8/chartex" xmlns:cx2="http://schemas.microsoft.com/office/drawing/2015/10/21/chartex" xmlns:cx3="http://schemas.microsoft.com/office/drawing/2016/5/9/chartex" xmlns:cx4="http://schemas.microsoft.com/office/drawing/2016/5/10/chartex" xmlns:cx5="http://schemas.microsoft.com/office/drawing/2016/5/11/chartex" xmlns:cx6="http://schemas.microsoft.com/office/drawing/2016/5/12/chartex" xmlns:cx7="http://schemas.microsoft.com/office/drawing/2016/5/13/chartex" xmlns:cx8="http://schemas.microsoft.com/office/drawing/2016/5/14/chartex" xmlns:mc="http://schemas.openxmlformats.org/markup-compatibility/2006" xmlns:aink="http://schemas.microsoft.com/office/drawing/2016/ink" xmlns:am3d="http://schemas.microsoft.com/office/drawing/2017/model3d" xmlns:o="urn:schemas-microsoft-com:office:office" xmlns:oel="http://schemas.microsoft.com/office/2019/extlst" xmlns:r="http://schemas.openxmlformats.org/officeDocument/2006/relationships" xmlns:m="http://schemas.openxmlformats.org/officeDocument/2006/math" xmlns:v="urn:schemas-microsoft-com:vml" xmlns:wp14="http://schemas.microsoft.com/office/word/2010/wordprocessingDrawing" xmlns:wp="http://schemas.openxmlformats.org/drawingml/2006/wordprocessingDrawing" xmlns:w10="urn:schemas-microsoft-com:office:word" xmlns:w="http://schemas.openxmlformats.org/wordprocessingml/2006/main" xmlns:w14="http://schemas.microsoft.com/office/word/2010/wordml" xmlns:w15="http://schemas.microsoft.com/office/word/2012/wordml" xmlns:w16cex="http://schemas.microsoft.com/office/word/2018/wordml/cex" xmlns:w16cid="http://schemas.microsoft.com/office/word/2016/wordml/cid" xmlns:w16="http://schemas.microsoft.com/office/word/2018/wordml" xmlns:w16du="http://schemas.microsoft.com/office/word/2023/wordml/word16du" xmlns:w16sdtdh="http://schemas.microsoft.com/office/word/2020/wordml/sdtdatahash" xmlns:w16se="http://schemas.microsoft.com/office/word/2015/wordml/symex" xmlns:wpg="http://schemas.microsoft.com/office/word/2010/wordprocessingGroup" xmlns:wpi="http://schemas.microsoft.com/office/word/2010/wordprocessingInk" xmlns:wne="http://schemas.microsoft.com/office/word/2006/wordml" xmlns:wps="http://schemas.microsoft.com/office/word/2010/wordprocessingShape" mc:Ignorable="w14 w15 w16se w16cid w16 w16cex w16sdtdh wp14">
   <w:footnote w:type="separator" w:id="-1">
     <w:p>
       <w:pPr>

</xml_diff>

<commit_message>
[2026.04.30 seo] update release deliverables
</commit_message>
<xml_diff>
--- a/logmile_deliverable/straffic/주간보고/[KDT] 인천부평_3기_3조_1주차_주간보고서.docx
+++ b/logmile_deliverable/straffic/주간보고/[KDT] 인천부평_3기_3조_1주차_주간보고서.docx
@@ -1,6 +1,6 @@
 
 <file path=word/document.xml><?xml version="1.0" encoding="utf-8"?>
-<w:document xmlns:wpc="http://schemas.microsoft.com/office/word/2010/wordprocessingCanvas" xmlns:cx="http://schemas.microsoft.com/office/drawing/2014/chartex" xmlns:cx1="http://schemas.microsoft.com/office/drawing/2015/9/8/chartex" xmlns:cx2="http://schemas.microsoft.com/office/drawing/2015/10/21/chartex" xmlns:cx3="http://schemas.microsoft.com/office/drawing/2016/5/9/chartex" xmlns:cx4="http://schemas.microsoft.com/office/drawing/2016/5/10/chartex" xmlns:cx5="http://schemas.microsoft.com/office/drawing/2016/5/11/chartex" xmlns:cx6="http://schemas.microsoft.com/office/drawing/2016/5/12/chartex" xmlns:cx7="http://schemas.microsoft.com/office/drawing/2016/5/13/chartex" xmlns:cx8="http://schemas.microsoft.com/office/drawing/2016/5/14/chartex" xmlns:mc="http://schemas.openxmlformats.org/markup-compatibility/2006" xmlns:aink="http://schemas.microsoft.com/office/drawing/2016/ink" xmlns:am3d="http://schemas.microsoft.com/office/drawing/2017/model3d" xmlns:o="urn:schemas-microsoft-com:office:office" xmlns:oel="http://schemas.microsoft.com/office/2019/extlst" xmlns:r="http://schemas.openxmlformats.org/officeDocument/2006/relationships" xmlns:m="http://schemas.openxmlformats.org/officeDocument/2006/math" xmlns:v="urn:schemas-microsoft-com:vml" xmlns:wp14="http://schemas.microsoft.com/office/word/2010/wordprocessingDrawing" xmlns:wp="http://schemas.openxmlformats.org/drawingml/2006/wordprocessingDrawing" xmlns:w10="urn:schemas-microsoft-com:office:word" xmlns:w="http://schemas.openxmlformats.org/wordprocessingml/2006/main" xmlns:w14="http://schemas.microsoft.com/office/word/2010/wordml" xmlns:w15="http://schemas.microsoft.com/office/word/2012/wordml" xmlns:w16cex="http://schemas.microsoft.com/office/word/2018/wordml/cex" xmlns:w16cid="http://schemas.microsoft.com/office/word/2016/wordml/cid" xmlns:w16="http://schemas.microsoft.com/office/word/2018/wordml" xmlns:w16sdtdh="http://schemas.microsoft.com/office/word/2020/wordml/sdtdatahash" xmlns:w16se="http://schemas.microsoft.com/office/word/2015/wordml/symex" xmlns:wpg="http://schemas.microsoft.com/office/word/2010/wordprocessingGroup" xmlns:wpi="http://schemas.microsoft.com/office/word/2010/wordprocessingInk" xmlns:wne="http://schemas.microsoft.com/office/word/2006/wordml" xmlns:wps="http://schemas.microsoft.com/office/word/2010/wordprocessingShape" mc:Ignorable="w14 w15 w16se w16cid w16 w16cex w16sdtdh wp14">
+<w:document xmlns:wpc="http://schemas.microsoft.com/office/word/2010/wordprocessingCanvas" xmlns:cx="http://schemas.microsoft.com/office/drawing/2014/chartex" xmlns:cx1="http://schemas.microsoft.com/office/drawing/2015/9/8/chartex" xmlns:cx2="http://schemas.microsoft.com/office/drawing/2015/10/21/chartex" xmlns:cx3="http://schemas.microsoft.com/office/drawing/2016/5/9/chartex" xmlns:cx4="http://schemas.microsoft.com/office/drawing/2016/5/10/chartex" xmlns:cx5="http://schemas.microsoft.com/office/drawing/2016/5/11/chartex" xmlns:cx6="http://schemas.microsoft.com/office/drawing/2016/5/12/chartex" xmlns:cx7="http://schemas.microsoft.com/office/drawing/2016/5/13/chartex" xmlns:cx8="http://schemas.microsoft.com/office/drawing/2016/5/14/chartex" xmlns:mc="http://schemas.openxmlformats.org/markup-compatibility/2006" xmlns:aink="http://schemas.microsoft.com/office/drawing/2016/ink" xmlns:am3d="http://schemas.microsoft.com/office/drawing/2017/model3d" xmlns:o="urn:schemas-microsoft-com:office:office" xmlns:oel="http://schemas.microsoft.com/office/2019/extlst" xmlns:r="http://schemas.openxmlformats.org/officeDocument/2006/relationships" xmlns:m="http://schemas.openxmlformats.org/officeDocument/2006/math" xmlns:v="urn:schemas-microsoft-com:vml" xmlns:wp14="http://schemas.microsoft.com/office/word/2010/wordprocessingDrawing" xmlns:wp="http://schemas.openxmlformats.org/drawingml/2006/wordprocessingDrawing" xmlns:w10="urn:schemas-microsoft-com:office:word" xmlns:w="http://schemas.openxmlformats.org/wordprocessingml/2006/main" xmlns:w14="http://schemas.microsoft.com/office/word/2010/wordml" xmlns:w15="http://schemas.microsoft.com/office/word/2012/wordml" xmlns:w16cex="http://schemas.microsoft.com/office/word/2018/wordml/cex" xmlns:w16cid="http://schemas.microsoft.com/office/word/2016/wordml/cid" xmlns:w16="http://schemas.microsoft.com/office/word/2018/wordml" xmlns:w16du="http://schemas.microsoft.com/office/word/2023/wordml/word16du" xmlns:w16sdtdh="http://schemas.microsoft.com/office/word/2020/wordml/sdtdatahash" xmlns:w16se="http://schemas.microsoft.com/office/word/2015/wordml/symex" xmlns:wpg="http://schemas.microsoft.com/office/word/2010/wordprocessingGroup" xmlns:wpi="http://schemas.microsoft.com/office/word/2010/wordprocessingInk" xmlns:wne="http://schemas.microsoft.com/office/word/2006/wordml" xmlns:wps="http://schemas.microsoft.com/office/word/2010/wordprocessingShape" mc:Ignorable="w14 w15 w16se w16cid w16 w16cex w16sdtdh wp14">
   <w:body>
     <w:p>
       <w:pPr>
@@ -128,29 +128,7 @@
           <w:sz w:val="20"/>
           <w:szCs w:val="20"/>
         </w:rPr>
-        <w:t xml:space="preserve">스마트 </w:t>
-      </w:r>
-      <w:proofErr w:type="spellStart"/>
-      <w:r>
-        <w:rPr>
-          <w:rFonts w:hint="eastAsia"/>
-          <w:b/>
-          <w:bCs/>
-          <w:sz w:val="20"/>
-          <w:szCs w:val="20"/>
-        </w:rPr>
-        <w:t>모빌리티</w:t>
-      </w:r>
-      <w:proofErr w:type="spellEnd"/>
-      <w:r>
-        <w:rPr>
-          <w:rFonts w:hint="eastAsia"/>
-          <w:b/>
-          <w:bCs/>
-          <w:sz w:val="20"/>
-          <w:szCs w:val="20"/>
-        </w:rPr>
-        <w:t xml:space="preserve"> DX 프로젝트</w:t>
+        <w:t>스마트 모빌리티 DX 프로젝트</w:t>
       </w:r>
       <w:r>
         <w:rPr>
@@ -169,7 +147,35 @@
           <w:sz w:val="20"/>
           <w:szCs w:val="20"/>
         </w:rPr>
-        <w:t xml:space="preserve"> 차량번호 인식 시스템 설계</w:t>
+        <w:t xml:space="preserve"> </w:t>
+      </w:r>
+      <w:r>
+        <w:rPr>
+          <w:rFonts w:hint="eastAsia"/>
+          <w:b/>
+          <w:bCs/>
+          <w:sz w:val="20"/>
+          <w:szCs w:val="20"/>
+        </w:rPr>
+        <w:t>화물차</w:t>
+      </w:r>
+      <w:r>
+        <w:rPr>
+          <w:b/>
+          <w:bCs/>
+          <w:sz w:val="20"/>
+          <w:szCs w:val="20"/>
+        </w:rPr>
+        <w:t xml:space="preserve"> 운전자 피로도 실시간 모니터링 시스템 설계</w:t>
+      </w:r>
+      <w:r>
+        <w:rPr>
+          <w:b/>
+          <w:bCs/>
+          <w:sz w:val="20"/>
+          <w:szCs w:val="20"/>
+        </w:rPr>
+        <w:t xml:space="preserve"> </w:t>
       </w:r>
       <w:r>
         <w:rPr>
@@ -344,7 +350,6 @@
         </w:rPr>
         <w:t xml:space="preserve">조, 팀장 </w:t>
       </w:r>
-      <w:proofErr w:type="spellStart"/>
       <w:r>
         <w:rPr>
           <w:rFonts w:hint="eastAsia"/>
@@ -355,7 +360,6 @@
         </w:rPr>
         <w:t>유환희</w:t>
       </w:r>
-      <w:proofErr w:type="spellEnd"/>
       <w:r>
         <w:rPr>
           <w:rFonts w:hint="eastAsia"/>
@@ -418,7 +422,6 @@
         <w:spacing w:after="0"/>
         <w:ind w:firstLineChars="100" w:firstLine="200"/>
         <w:rPr>
-          <w:rFonts w:hint="eastAsia"/>
           <w:sz w:val="20"/>
           <w:szCs w:val="20"/>
         </w:rPr>
@@ -446,7 +449,6 @@
         <w:spacing w:after="0"/>
         <w:ind w:firstLineChars="100" w:firstLine="200"/>
         <w:rPr>
-          <w:rFonts w:hint="eastAsia"/>
           <w:sz w:val="20"/>
           <w:szCs w:val="20"/>
         </w:rPr>
@@ -459,41 +461,13 @@
         </w:rPr>
         <w:t xml:space="preserve">     1) </w:t>
       </w:r>
-      <w:proofErr w:type="spellStart"/>
-      <w:r>
-        <w:rPr>
-          <w:rFonts w:hint="eastAsia"/>
-          <w:sz w:val="20"/>
-          <w:szCs w:val="20"/>
-        </w:rPr>
-        <w:t>거점지</w:t>
-      </w:r>
-      <w:proofErr w:type="spellEnd"/>
-      <w:r>
-        <w:rPr>
-          <w:rFonts w:hint="eastAsia"/>
-          <w:sz w:val="20"/>
-          <w:szCs w:val="20"/>
-        </w:rPr>
-        <w:t xml:space="preserve">(센터)에서 </w:t>
-      </w:r>
-      <w:proofErr w:type="spellStart"/>
-      <w:r>
-        <w:rPr>
-          <w:rFonts w:hint="eastAsia"/>
-          <w:sz w:val="20"/>
-          <w:szCs w:val="20"/>
-        </w:rPr>
-        <w:t>출도착</w:t>
-      </w:r>
-      <w:proofErr w:type="spellEnd"/>
-      <w:r>
-        <w:rPr>
-          <w:rFonts w:hint="eastAsia"/>
-          <w:sz w:val="20"/>
-          <w:szCs w:val="20"/>
-        </w:rPr>
-        <w:t xml:space="preserve"> 시 번호판을 읽어 운행시간 판별</w:t>
+      <w:r>
+        <w:rPr>
+          <w:rFonts w:hint="eastAsia"/>
+          <w:sz w:val="20"/>
+          <w:szCs w:val="20"/>
+        </w:rPr>
+        <w:t>거점지(센터)에서 출도착 시 번호판을 읽어 운행시간 판별</w:t>
       </w:r>
     </w:p>
     <w:p>
@@ -502,7 +476,6 @@
         <w:spacing w:after="0"/>
         <w:ind w:firstLineChars="100" w:firstLine="200"/>
         <w:rPr>
-          <w:rFonts w:hint="eastAsia"/>
           <w:sz w:val="20"/>
           <w:szCs w:val="20"/>
         </w:rPr>
@@ -606,36 +579,17 @@
         <w:spacing w:after="0"/>
         <w:ind w:firstLineChars="100" w:firstLine="200"/>
         <w:rPr>
-          <w:rFonts w:hint="eastAsia"/>
-          <w:sz w:val="20"/>
-          <w:szCs w:val="20"/>
-        </w:rPr>
-      </w:pPr>
-      <w:r>
-        <w:rPr>
-          <w:rFonts w:hint="eastAsia"/>
-          <w:sz w:val="20"/>
-          <w:szCs w:val="20"/>
-        </w:rPr>
-        <w:t xml:space="preserve">   ∙ 협업 : git, </w:t>
-      </w:r>
-      <w:proofErr w:type="spellStart"/>
-      <w:r>
-        <w:rPr>
-          <w:rFonts w:hint="eastAsia"/>
-          <w:sz w:val="20"/>
-          <w:szCs w:val="20"/>
-        </w:rPr>
-        <w:t>github</w:t>
-      </w:r>
-      <w:proofErr w:type="spellEnd"/>
-      <w:r>
-        <w:rPr>
-          <w:rFonts w:hint="eastAsia"/>
-          <w:sz w:val="20"/>
-          <w:szCs w:val="20"/>
-        </w:rPr>
-        <w:t xml:space="preserve">, notion, </w:t>
+          <w:sz w:val="20"/>
+          <w:szCs w:val="20"/>
+        </w:rPr>
+      </w:pPr>
+      <w:r>
+        <w:rPr>
+          <w:rFonts w:hint="eastAsia"/>
+          <w:sz w:val="20"/>
+          <w:szCs w:val="20"/>
+        </w:rPr>
+        <w:t xml:space="preserve">   ∙ 협업 : git, github, notion, </w:t>
       </w:r>
       <w:r>
         <w:rPr>
@@ -669,25 +623,7 @@
           <w:sz w:val="20"/>
           <w:szCs w:val="20"/>
         </w:rPr>
-        <w:t xml:space="preserve">   ∙ </w:t>
-      </w:r>
-      <w:proofErr w:type="spellStart"/>
-      <w:r>
-        <w:rPr>
-          <w:rFonts w:hint="eastAsia"/>
-          <w:sz w:val="20"/>
-          <w:szCs w:val="20"/>
-        </w:rPr>
-        <w:t>백엔드</w:t>
-      </w:r>
-      <w:proofErr w:type="spellEnd"/>
-      <w:r>
-        <w:rPr>
-          <w:rFonts w:hint="eastAsia"/>
-          <w:sz w:val="20"/>
-          <w:szCs w:val="20"/>
-        </w:rPr>
-        <w:t xml:space="preserve"> 프레임워크 : Spring boot</w:t>
+        <w:t xml:space="preserve">   ∙ 백엔드 프레임워크 : Spring boot</w:t>
       </w:r>
     </w:p>
     <w:p>
@@ -706,52 +642,94 @@
           <w:sz w:val="20"/>
           <w:szCs w:val="20"/>
         </w:rPr>
-        <w:t xml:space="preserve">   ∙ </w:t>
-      </w:r>
-      <w:proofErr w:type="spellStart"/>
-      <w:r>
-        <w:rPr>
-          <w:rFonts w:hint="eastAsia"/>
-          <w:sz w:val="20"/>
-          <w:szCs w:val="20"/>
-        </w:rPr>
-        <w:t>프론트엔드</w:t>
-      </w:r>
-      <w:proofErr w:type="spellEnd"/>
-      <w:r>
-        <w:rPr>
-          <w:rFonts w:hint="eastAsia"/>
-          <w:sz w:val="20"/>
-          <w:szCs w:val="20"/>
-        </w:rPr>
-        <w:t xml:space="preserve"> 프레임워크 : node.js, vue.js, chart.js, vs code, </w:t>
-      </w:r>
-      <w:proofErr w:type="spellStart"/>
-      <w:r>
-        <w:rPr>
-          <w:rFonts w:hint="eastAsia"/>
-          <w:sz w:val="20"/>
-          <w:szCs w:val="20"/>
-        </w:rPr>
-        <w:t>pinia</w:t>
-      </w:r>
-      <w:proofErr w:type="spellEnd"/>
-      <w:r>
-        <w:rPr>
+        <w:t xml:space="preserve">   ∙ 프론트엔드 프레임워크 : node.js, vue.js, chart.js, vs code, pinia</w:t>
+      </w:r>
+      <w:r>
+        <w:rPr>
+          <w:sz w:val="20"/>
+          <w:szCs w:val="20"/>
+        </w:rPr>
+        <w:t>, Axios</w:t>
+      </w:r>
+    </w:p>
+    <w:p>
+      <w:pPr>
+        <w:wordWrap/>
+        <w:spacing w:after="0"/>
+        <w:ind w:firstLineChars="100" w:firstLine="200"/>
+        <w:rPr>
+          <w:sz w:val="20"/>
+          <w:szCs w:val="20"/>
+        </w:rPr>
+      </w:pPr>
+      <w:r>
+        <w:rPr>
+          <w:rFonts w:hint="eastAsia"/>
+          <w:sz w:val="20"/>
+          <w:szCs w:val="20"/>
+        </w:rPr>
+        <w:t xml:space="preserve">   ∙ 인공지능(AI) / 머신러닝(ML) : </w:t>
+      </w:r>
+      <w:r>
+        <w:rPr>
+          <w:sz w:val="20"/>
+          <w:szCs w:val="20"/>
+        </w:rPr>
+        <w:t>YOLO8</w:t>
+      </w:r>
+      <w:r>
+        <w:rPr>
+          <w:rFonts w:hint="eastAsia"/>
           <w:sz w:val="20"/>
           <w:szCs w:val="20"/>
         </w:rPr>
         <w:t xml:space="preserve">, </w:t>
       </w:r>
-      <w:proofErr w:type="spellStart"/>
-      <w:r>
-        <w:rPr>
-          <w:sz w:val="20"/>
-          <w:szCs w:val="20"/>
-        </w:rPr>
-        <w:t>Axios</w:t>
-      </w:r>
-      <w:proofErr w:type="spellEnd"/>
+      <w:r>
+        <w:rPr>
+          <w:sz w:val="20"/>
+          <w:szCs w:val="20"/>
+        </w:rPr>
+        <w:t>Opencv</w:t>
+      </w:r>
+      <w:r>
+        <w:rPr>
+          <w:rFonts w:hint="eastAsia"/>
+          <w:sz w:val="20"/>
+          <w:szCs w:val="20"/>
+        </w:rPr>
+        <w:t xml:space="preserve">, </w:t>
+      </w:r>
+      <w:r>
+        <w:rPr>
+          <w:sz w:val="20"/>
+          <w:szCs w:val="20"/>
+        </w:rPr>
+        <w:t>Easy</w:t>
+      </w:r>
+      <w:r>
+        <w:rPr>
+          <w:rFonts w:hint="eastAsia"/>
+          <w:sz w:val="20"/>
+          <w:szCs w:val="20"/>
+        </w:rPr>
+        <w:t>O</w:t>
+      </w:r>
+      <w:r>
+        <w:rPr>
+          <w:sz w:val="20"/>
+          <w:szCs w:val="20"/>
+        </w:rPr>
+        <w:t>CR</w:t>
+      </w:r>
+      <w:r>
+        <w:rPr>
+          <w:rFonts w:hint="eastAsia"/>
+          <w:sz w:val="20"/>
+          <w:szCs w:val="20"/>
+        </w:rPr>
+        <w:t>, python</w:t>
+      </w:r>
     </w:p>
     <w:p>
       <w:pPr>
@@ -769,32 +747,22 @@
           <w:sz w:val="20"/>
           <w:szCs w:val="20"/>
         </w:rPr>
-        <w:t xml:space="preserve">   ∙ 인공지능(AI) / </w:t>
-      </w:r>
-      <w:proofErr w:type="spellStart"/>
-      <w:r>
-        <w:rPr>
-          <w:rFonts w:hint="eastAsia"/>
-          <w:sz w:val="20"/>
-          <w:szCs w:val="20"/>
-        </w:rPr>
-        <w:t>머신러닝</w:t>
-      </w:r>
-      <w:proofErr w:type="spellEnd"/>
-      <w:r>
-        <w:rPr>
-          <w:rFonts w:hint="eastAsia"/>
-          <w:sz w:val="20"/>
-          <w:szCs w:val="20"/>
-        </w:rPr>
-        <w:t xml:space="preserve">(ML) : </w:t>
-      </w:r>
-      <w:r>
-        <w:rPr>
-          <w:sz w:val="20"/>
-          <w:szCs w:val="20"/>
-        </w:rPr>
-        <w:t>YOLO8</w:t>
+        <w:t xml:space="preserve">   ∙ 인공지능(AI) 어시스턴트 : </w:t>
+      </w:r>
+      <w:r>
+        <w:rPr>
+          <w:rFonts w:hint="eastAsia"/>
+          <w:sz w:val="20"/>
+          <w:szCs w:val="20"/>
+        </w:rPr>
+        <w:t>G</w:t>
+      </w:r>
+      <w:r>
+        <w:rPr>
+          <w:sz w:val="20"/>
+          <w:szCs w:val="20"/>
+        </w:rPr>
+        <w:t>emini</w:t>
       </w:r>
       <w:r>
         <w:rPr>
@@ -804,15 +772,13 @@
         </w:rPr>
         <w:t xml:space="preserve">, </w:t>
       </w:r>
-      <w:proofErr w:type="spellStart"/>
-      <w:r>
-        <w:rPr>
-          <w:sz w:val="20"/>
-          <w:szCs w:val="20"/>
-        </w:rPr>
-        <w:t>Opencv</w:t>
-      </w:r>
-      <w:proofErr w:type="spellEnd"/>
+      <w:r>
+        <w:rPr>
+          <w:sz w:val="20"/>
+          <w:szCs w:val="20"/>
+        </w:rPr>
+        <w:t>Claude</w:t>
+      </w:r>
       <w:r>
         <w:rPr>
           <w:rFonts w:hint="eastAsia"/>
@@ -821,37 +787,12 @@
         </w:rPr>
         <w:t xml:space="preserve">, </w:t>
       </w:r>
-      <w:proofErr w:type="spellStart"/>
-      <w:r>
-        <w:rPr>
-          <w:sz w:val="20"/>
-          <w:szCs w:val="20"/>
-        </w:rPr>
-        <w:t>Easy</w:t>
-      </w:r>
-      <w:r>
-        <w:rPr>
-          <w:rFonts w:hint="eastAsia"/>
-          <w:sz w:val="20"/>
-          <w:szCs w:val="20"/>
-        </w:rPr>
-        <w:t>O</w:t>
-      </w:r>
-      <w:r>
-        <w:rPr>
-          <w:sz w:val="20"/>
-          <w:szCs w:val="20"/>
-        </w:rPr>
-        <w:t>CR</w:t>
-      </w:r>
-      <w:proofErr w:type="spellEnd"/>
-      <w:r>
-        <w:rPr>
-          <w:rFonts w:hint="eastAsia"/>
-          <w:sz w:val="20"/>
-          <w:szCs w:val="20"/>
-        </w:rPr>
-        <w:t>, python</w:t>
+      <w:r>
+        <w:rPr>
+          <w:sz w:val="20"/>
+          <w:szCs w:val="20"/>
+        </w:rPr>
+        <w:t>Codex</w:t>
       </w:r>
     </w:p>
     <w:p>
@@ -860,62 +801,21 @@
         <w:spacing w:after="0"/>
         <w:ind w:firstLineChars="100" w:firstLine="200"/>
         <w:rPr>
-          <w:sz w:val="20"/>
-          <w:szCs w:val="20"/>
-        </w:rPr>
-      </w:pPr>
-      <w:r>
-        <w:rPr>
-          <w:rFonts w:hint="eastAsia"/>
-          <w:sz w:val="20"/>
-          <w:szCs w:val="20"/>
-        </w:rPr>
-        <w:t xml:space="preserve">   ∙ 인공지능(AI) 어시스턴트 : </w:t>
-      </w:r>
-      <w:r>
-        <w:rPr>
-          <w:rFonts w:hint="eastAsia"/>
-          <w:sz w:val="20"/>
-          <w:szCs w:val="20"/>
-        </w:rPr>
-        <w:t>G</w:t>
-      </w:r>
-      <w:r>
-        <w:rPr>
-          <w:sz w:val="20"/>
-          <w:szCs w:val="20"/>
-        </w:rPr>
-        <w:t>emini</w:t>
-      </w:r>
-      <w:r>
-        <w:rPr>
-          <w:rFonts w:hint="eastAsia"/>
-          <w:sz w:val="20"/>
-          <w:szCs w:val="20"/>
-        </w:rPr>
-        <w:t xml:space="preserve">, </w:t>
-      </w:r>
-      <w:r>
-        <w:rPr>
-          <w:sz w:val="20"/>
-          <w:szCs w:val="20"/>
-        </w:rPr>
-        <w:t>Claude</w:t>
-      </w:r>
-      <w:r>
-        <w:rPr>
-          <w:rFonts w:hint="eastAsia"/>
-          <w:sz w:val="20"/>
-          <w:szCs w:val="20"/>
-        </w:rPr>
-        <w:t xml:space="preserve">, </w:t>
-      </w:r>
-      <w:r>
-        <w:rPr>
-          <w:sz w:val="20"/>
-          <w:szCs w:val="20"/>
-        </w:rPr>
-        <w:t>Codex</w:t>
+          <w:b/>
+          <w:bCs/>
+          <w:sz w:val="20"/>
+          <w:szCs w:val="20"/>
+        </w:rPr>
+      </w:pPr>
+      <w:r>
+        <w:rPr>
+          <w:rFonts w:hint="eastAsia"/>
+          <w:b/>
+          <w:bCs/>
+          <w:sz w:val="20"/>
+          <w:szCs w:val="20"/>
+        </w:rPr>
+        <w:t xml:space="preserve">  - 개발 및 운영환경 설정</w:t>
       </w:r>
     </w:p>
     <w:p>
@@ -924,21 +824,32 @@
         <w:spacing w:after="0"/>
         <w:ind w:firstLineChars="100" w:firstLine="200"/>
         <w:rPr>
-          <w:b/>
-          <w:bCs/>
-          <w:sz w:val="20"/>
-          <w:szCs w:val="20"/>
-        </w:rPr>
-      </w:pPr>
-      <w:r>
-        <w:rPr>
-          <w:rFonts w:hint="eastAsia"/>
-          <w:b/>
-          <w:bCs/>
-          <w:sz w:val="20"/>
-          <w:szCs w:val="20"/>
-        </w:rPr>
-        <w:t xml:space="preserve">  - 개발 및 운영환경 설정</w:t>
+          <w:sz w:val="20"/>
+          <w:szCs w:val="20"/>
+        </w:rPr>
+      </w:pPr>
+      <w:r>
+        <w:rPr>
+          <w:rFonts w:hint="eastAsia"/>
+          <w:sz w:val="20"/>
+          <w:szCs w:val="20"/>
+        </w:rPr>
+        <w:t xml:space="preserve">   ∙ 클라우드 기반 환경 (window1</w:t>
+      </w:r>
+      <w:r>
+        <w:rPr>
+          <w:sz w:val="20"/>
+          <w:szCs w:val="20"/>
+        </w:rPr>
+        <w:t>1, Mac</w:t>
+      </w:r>
+      <w:r>
+        <w:rPr>
+          <w:rFonts w:hint="eastAsia"/>
+          <w:sz w:val="20"/>
+          <w:szCs w:val="20"/>
+        </w:rPr>
+        <w:t>, linux)</w:t>
       </w:r>
     </w:p>
     <w:p>
@@ -957,40 +868,14 @@
           <w:sz w:val="20"/>
           <w:szCs w:val="20"/>
         </w:rPr>
-        <w:t xml:space="preserve">   ∙ 클라우드 기반 환경 (window1</w:t>
-      </w:r>
-      <w:r>
-        <w:rPr>
-          <w:sz w:val="20"/>
-          <w:szCs w:val="20"/>
-        </w:rPr>
-        <w:t>1, Mac</w:t>
-      </w:r>
-      <w:r>
-        <w:rPr>
-          <w:rFonts w:hint="eastAsia"/>
-          <w:sz w:val="20"/>
-          <w:szCs w:val="20"/>
-        </w:rPr>
-        <w:t xml:space="preserve">, </w:t>
-      </w:r>
-      <w:proofErr w:type="spellStart"/>
-      <w:r>
-        <w:rPr>
-          <w:rFonts w:hint="eastAsia"/>
-          <w:sz w:val="20"/>
-          <w:szCs w:val="20"/>
-        </w:rPr>
-        <w:t>linux</w:t>
-      </w:r>
-      <w:proofErr w:type="spellEnd"/>
-      <w:r>
-        <w:rPr>
-          <w:rFonts w:hint="eastAsia"/>
-          <w:sz w:val="20"/>
-          <w:szCs w:val="20"/>
-        </w:rPr>
-        <w:t>)</w:t>
+        <w:t xml:space="preserve">    1) </w:t>
+      </w:r>
+      <w:r>
+        <w:rPr>
+          <w:sz w:val="20"/>
+          <w:szCs w:val="20"/>
+        </w:rPr>
+        <w:t>Docker, Docker-compose</w:t>
       </w:r>
     </w:p>
     <w:p>
@@ -1009,14 +894,7 @@
           <w:sz w:val="20"/>
           <w:szCs w:val="20"/>
         </w:rPr>
-        <w:t xml:space="preserve">    1) </w:t>
-      </w:r>
-      <w:r>
-        <w:rPr>
-          <w:sz w:val="20"/>
-          <w:szCs w:val="20"/>
-        </w:rPr>
-        <w:t>Docker, Docker-compose</w:t>
+        <w:t xml:space="preserve">    2-1) window11 - WSL2 + Docker Desktop 설치, JDK 21, IntelliJ IDEA (Spring Boot 백엔드), VS Code (Vue.js 프론트), Git, Python 3.11 (FastAPI/YOLOv8)</w:t>
       </w:r>
     </w:p>
     <w:p>
@@ -1031,37 +909,10 @@
       </w:pPr>
       <w:r>
         <w:rPr>
-          <w:rFonts w:hint="eastAsia"/>
-          <w:sz w:val="20"/>
-          <w:szCs w:val="20"/>
-        </w:rPr>
-        <w:t xml:space="preserve">    2-1) window11 - WSL2 + Docker Desktop 설치, JDK 21, IntelliJ IDEA (Spring Boot 백엔드), VS Code (Vue.js 프론트), Git, Python 3.11 (FastAPI/YOLOv8)</w:t>
-      </w:r>
-      <w:r>
-        <w:rPr>
-          <w:sz w:val="20"/>
-          <w:szCs w:val="20"/>
-        </w:rPr>
-      </w:r>
-      <w:r>
-        <w:rPr>
-          <w:rFonts w:hint="eastAsia"/>
-          <w:sz w:val="20"/>
-          <w:szCs w:val="20"/>
-        </w:rPr>
-      </w:r>
-      <w:r>
-        <w:rPr>
-          <w:sz w:val="20"/>
-          <w:szCs w:val="20"/>
-        </w:rPr>
-      </w:r>
-      <w:r>
-        <w:rPr>
-          <w:rFonts w:hint="eastAsia"/>
-          <w:sz w:val="20"/>
-          <w:szCs w:val="20"/>
-        </w:rPr>
+          <w:sz w:val="20"/>
+          <w:szCs w:val="20"/>
+        </w:rPr>
+        <w:t xml:space="preserve">    2-2) Mac - Docker Desktop 설치, JDK 21, IntelliJ IDEA (Spring Boot 백엔드), VS Code (Vue.js 프론트), Homebrew, Git, Python 3.11 (FastAPI/YOLOv8)</w:t>
       </w:r>
     </w:p>
     <w:p>
@@ -1070,51 +921,16 @@
         <w:spacing w:after="0"/>
         <w:ind w:firstLineChars="100" w:firstLine="200"/>
         <w:rPr>
-          <w:rFonts w:hint="eastAsia"/>
-          <w:sz w:val="20"/>
-          <w:szCs w:val="20"/>
-        </w:rPr>
-      </w:pPr>
-      <w:r>
-        <w:rPr>
-          <w:sz w:val="20"/>
-          <w:szCs w:val="20"/>
-        </w:rPr>
-        <w:t xml:space="preserve">    2-2) Mac - Docker Desktop 설치, JDK 21, IntelliJ IDEA (Spring Boot 백엔드), VS Code (Vue.js 프론트), Homebrew, Git, Python 3.11 (FastAPI/YOLOv8)</w:t>
-      </w:r>
-    </w:p>
-    <w:p>
-      <w:pPr>
-        <w:wordWrap/>
-        <w:spacing w:after="0"/>
-        <w:ind w:firstLineChars="100" w:firstLine="200"/>
-        <w:rPr>
-          <w:sz w:val="20"/>
-          <w:szCs w:val="20"/>
-        </w:rPr>
-      </w:pPr>
-      <w:r>
-        <w:rPr>
-          <w:sz w:val="20"/>
-          <w:szCs w:val="20"/>
-        </w:rPr>
-        <w:t xml:space="preserve">    3) </w:t>
-      </w:r>
-      <w:proofErr w:type="spellStart"/>
-      <w:r>
-        <w:rPr>
-          <w:sz w:val="20"/>
-          <w:szCs w:val="20"/>
-        </w:rPr>
-        <w:t>linux</w:t>
-      </w:r>
-      <w:proofErr w:type="spellEnd"/>
-      <w:r>
-        <w:rPr>
-          <w:sz w:val="20"/>
-          <w:szCs w:val="20"/>
-        </w:rPr>
-        <w:t xml:space="preserve">환경 배포 </w:t>
+          <w:sz w:val="20"/>
+          <w:szCs w:val="20"/>
+        </w:rPr>
+      </w:pPr>
+      <w:r>
+        <w:rPr>
+          <w:sz w:val="20"/>
+          <w:szCs w:val="20"/>
+        </w:rPr>
+        <w:t xml:space="preserve">    3) linux환경 배포 </w:t>
       </w:r>
       <w:r>
         <w:rPr>
@@ -1142,39 +958,7 @@
           <w:sz w:val="20"/>
           <w:szCs w:val="20"/>
         </w:rPr>
-        <w:t xml:space="preserve">/ai 최적화, 자동 보안 패치, </w:t>
-      </w:r>
-      <w:proofErr w:type="spellStart"/>
-      <w:r>
-        <w:rPr>
-          <w:sz w:val="20"/>
-          <w:szCs w:val="20"/>
-        </w:rPr>
-        <w:t>ssh</w:t>
-      </w:r>
-      <w:proofErr w:type="spellEnd"/>
-      <w:r>
-        <w:rPr>
-          <w:sz w:val="20"/>
-          <w:szCs w:val="20"/>
-        </w:rPr>
-        <w:t xml:space="preserve">키 + docker로 </w:t>
-      </w:r>
-      <w:proofErr w:type="spellStart"/>
-      <w:r>
-        <w:rPr>
-          <w:sz w:val="20"/>
-          <w:szCs w:val="20"/>
-        </w:rPr>
-        <w:t>핫픽스</w:t>
-      </w:r>
-      <w:proofErr w:type="spellEnd"/>
-      <w:r>
-        <w:rPr>
-          <w:sz w:val="20"/>
-          <w:szCs w:val="20"/>
-        </w:rPr>
-        <w:t xml:space="preserve"> 가능</w:t>
+        <w:t>/ai 최적화, 자동 보안 패치, ssh키 + docker로 핫픽스 가능</w:t>
       </w:r>
     </w:p>
     <w:p>
@@ -1535,7 +1319,6 @@
                 <w:szCs w:val="20"/>
               </w:rPr>
             </w:pPr>
-            <w:proofErr w:type="spellStart"/>
             <w:r>
               <w:rPr>
                 <w:rFonts w:hint="eastAsia"/>
@@ -1544,7 +1327,6 @@
               </w:rPr>
               <w:t>진척률</w:t>
             </w:r>
-            <w:proofErr w:type="spellEnd"/>
           </w:p>
         </w:tc>
         <w:tc>
@@ -1961,6 +1743,7 @@
                 <w:sz w:val="20"/>
                 <w:szCs w:val="20"/>
               </w:rPr>
+              <w:lastRenderedPageBreak/>
               <w:t>합계</w:t>
             </w:r>
           </w:p>
@@ -2061,7 +1844,6 @@
         <w:spacing w:after="0"/>
         <w:ind w:firstLineChars="100" w:firstLine="200"/>
         <w:rPr>
-          <w:rFonts w:hint="eastAsia"/>
           <w:sz w:val="20"/>
           <w:szCs w:val="20"/>
         </w:rPr>
@@ -2078,7 +1860,7 @@
 </file>
 
 <file path=word/endnotes.xml><?xml version="1.0" encoding="utf-8"?>
-<w:endnotes xmlns:wpc="http://schemas.microsoft.com/office/word/2010/wordprocessingCanvas" xmlns:cx="http://schemas.microsoft.com/office/drawing/2014/chartex" xmlns:cx1="http://schemas.microsoft.com/office/drawing/2015/9/8/chartex" xmlns:cx2="http://schemas.microsoft.com/office/drawing/2015/10/21/chartex" xmlns:cx3="http://schemas.microsoft.com/office/drawing/2016/5/9/chartex" xmlns:cx4="http://schemas.microsoft.com/office/drawing/2016/5/10/chartex" xmlns:cx5="http://schemas.microsoft.com/office/drawing/2016/5/11/chartex" xmlns:cx6="http://schemas.microsoft.com/office/drawing/2016/5/12/chartex" xmlns:cx7="http://schemas.microsoft.com/office/drawing/2016/5/13/chartex" xmlns:cx8="http://schemas.microsoft.com/office/drawing/2016/5/14/chartex" xmlns:mc="http://schemas.openxmlformats.org/markup-compatibility/2006" xmlns:aink="http://schemas.microsoft.com/office/drawing/2016/ink" xmlns:am3d="http://schemas.microsoft.com/office/drawing/2017/model3d" xmlns:o="urn:schemas-microsoft-com:office:office" xmlns:oel="http://schemas.microsoft.com/office/2019/extlst" xmlns:r="http://schemas.openxmlformats.org/officeDocument/2006/relationships" xmlns:m="http://schemas.openxmlformats.org/officeDocument/2006/math" xmlns:v="urn:schemas-microsoft-com:vml" xmlns:wp14="http://schemas.microsoft.com/office/word/2010/wordprocessingDrawing" xmlns:wp="http://schemas.openxmlformats.org/drawingml/2006/wordprocessingDrawing" xmlns:w10="urn:schemas-microsoft-com:office:word" xmlns:w="http://schemas.openxmlformats.org/wordprocessingml/2006/main" xmlns:w14="http://schemas.microsoft.com/office/word/2010/wordml" xmlns:w15="http://schemas.microsoft.com/office/word/2012/wordml" xmlns:w16cex="http://schemas.microsoft.com/office/word/2018/wordml/cex" xmlns:w16cid="http://schemas.microsoft.com/office/word/2016/wordml/cid" xmlns:w16="http://schemas.microsoft.com/office/word/2018/wordml" xmlns:w16sdtdh="http://schemas.microsoft.com/office/word/2020/wordml/sdtdatahash" xmlns:w16se="http://schemas.microsoft.com/office/word/2015/wordml/symex" xmlns:wpg="http://schemas.microsoft.com/office/word/2010/wordprocessingGroup" xmlns:wpi="http://schemas.microsoft.com/office/word/2010/wordprocessingInk" xmlns:wne="http://schemas.microsoft.com/office/word/2006/wordml" xmlns:wps="http://schemas.microsoft.com/office/word/2010/wordprocessingShape" mc:Ignorable="w14 w15 w16se w16cid w16 w16cex w16sdtdh wp14">
+<w:endnotes xmlns:wpc="http://schemas.microsoft.com/office/word/2010/wordprocessingCanvas" xmlns:cx="http://schemas.microsoft.com/office/drawing/2014/chartex" xmlns:cx1="http://schemas.microsoft.com/office/drawing/2015/9/8/chartex" xmlns:cx2="http://schemas.microsoft.com/office/drawing/2015/10/21/chartex" xmlns:cx3="http://schemas.microsoft.com/office/drawing/2016/5/9/chartex" xmlns:cx4="http://schemas.microsoft.com/office/drawing/2016/5/10/chartex" xmlns:cx5="http://schemas.microsoft.com/office/drawing/2016/5/11/chartex" xmlns:cx6="http://schemas.microsoft.com/office/drawing/2016/5/12/chartex" xmlns:cx7="http://schemas.microsoft.com/office/drawing/2016/5/13/chartex" xmlns:cx8="http://schemas.microsoft.com/office/drawing/2016/5/14/chartex" xmlns:mc="http://schemas.openxmlformats.org/markup-compatibility/2006" xmlns:aink="http://schemas.microsoft.com/office/drawing/2016/ink" xmlns:am3d="http://schemas.microsoft.com/office/drawing/2017/model3d" xmlns:o="urn:schemas-microsoft-com:office:office" xmlns:oel="http://schemas.microsoft.com/office/2019/extlst" xmlns:r="http://schemas.openxmlformats.org/officeDocument/2006/relationships" xmlns:m="http://schemas.openxmlformats.org/officeDocument/2006/math" xmlns:v="urn:schemas-microsoft-com:vml" xmlns:wp14="http://schemas.microsoft.com/office/word/2010/wordprocessingDrawing" xmlns:wp="http://schemas.openxmlformats.org/drawingml/2006/wordprocessingDrawing" xmlns:w10="urn:schemas-microsoft-com:office:word" xmlns:w="http://schemas.openxmlformats.org/wordprocessingml/2006/main" xmlns:w14="http://schemas.microsoft.com/office/word/2010/wordml" xmlns:w15="http://schemas.microsoft.com/office/word/2012/wordml" xmlns:w16cex="http://schemas.microsoft.com/office/word/2018/wordml/cex" xmlns:w16cid="http://schemas.microsoft.com/office/word/2016/wordml/cid" xmlns:w16="http://schemas.microsoft.com/office/word/2018/wordml" xmlns:w16du="http://schemas.microsoft.com/office/word/2023/wordml/word16du" xmlns:w16sdtdh="http://schemas.microsoft.com/office/word/2020/wordml/sdtdatahash" xmlns:w16se="http://schemas.microsoft.com/office/word/2015/wordml/symex" xmlns:wpg="http://schemas.microsoft.com/office/word/2010/wordprocessingGroup" xmlns:wpi="http://schemas.microsoft.com/office/word/2010/wordprocessingInk" xmlns:wne="http://schemas.microsoft.com/office/word/2006/wordml" xmlns:wps="http://schemas.microsoft.com/office/word/2010/wordprocessingShape" mc:Ignorable="w14 w15 w16se w16cid w16 w16cex w16sdtdh wp14">
   <w:endnote w:type="separator" w:id="-1">
     <w:p>
       <w:pPr>
@@ -2103,7 +1885,7 @@
 </file>
 
 <file path=word/footnotes.xml><?xml version="1.0" encoding="utf-8"?>
-<w:footnotes xmlns:wpc="http://schemas.microsoft.com/office/word/2010/wordprocessingCanvas" xmlns:cx="http://schemas.microsoft.com/office/drawing/2014/chartex" xmlns:cx1="http://schemas.microsoft.com/office/drawing/2015/9/8/chartex" xmlns:cx2="http://schemas.microsoft.com/office/drawing/2015/10/21/chartex" xmlns:cx3="http://schemas.microsoft.com/office/drawing/2016/5/9/chartex" xmlns:cx4="http://schemas.microsoft.com/office/drawing/2016/5/10/chartex" xmlns:cx5="http://schemas.microsoft.com/office/drawing/2016/5/11/chartex" xmlns:cx6="http://schemas.microsoft.com/office/drawing/2016/5/12/chartex" xmlns:cx7="http://schemas.microsoft.com/office/drawing/2016/5/13/chartex" xmlns:cx8="http://schemas.microsoft.com/office/drawing/2016/5/14/chartex" xmlns:mc="http://schemas.openxmlformats.org/markup-compatibility/2006" xmlns:aink="http://schemas.microsoft.com/office/drawing/2016/ink" xmlns:am3d="http://schemas.microsoft.com/office/drawing/2017/model3d" xmlns:o="urn:schemas-microsoft-com:office:office" xmlns:oel="http://schemas.microsoft.com/office/2019/extlst" xmlns:r="http://schemas.openxmlformats.org/officeDocument/2006/relationships" xmlns:m="http://schemas.openxmlformats.org/officeDocument/2006/math" xmlns:v="urn:schemas-microsoft-com:vml" xmlns:wp14="http://schemas.microsoft.com/office/word/2010/wordprocessingDrawing" xmlns:wp="http://schemas.openxmlformats.org/drawingml/2006/wordprocessingDrawing" xmlns:w10="urn:schemas-microsoft-com:office:word" xmlns:w="http://schemas.openxmlformats.org/wordprocessingml/2006/main" xmlns:w14="http://schemas.microsoft.com/office/word/2010/wordml" xmlns:w15="http://schemas.microsoft.com/office/word/2012/wordml" xmlns:w16cex="http://schemas.microsoft.com/office/word/2018/wordml/cex" xmlns:w16cid="http://schemas.microsoft.com/office/word/2016/wordml/cid" xmlns:w16="http://schemas.microsoft.com/office/word/2018/wordml" xmlns:w16sdtdh="http://schemas.microsoft.com/office/word/2020/wordml/sdtdatahash" xmlns:w16se="http://schemas.microsoft.com/office/word/2015/wordml/symex" xmlns:wpg="http://schemas.microsoft.com/office/word/2010/wordprocessingGroup" xmlns:wpi="http://schemas.microsoft.com/office/word/2010/wordprocessingInk" xmlns:wne="http://schemas.microsoft.com/office/word/2006/wordml" xmlns:wps="http://schemas.microsoft.com/office/word/2010/wordprocessingShape" mc:Ignorable="w14 w15 w16se w16cid w16 w16cex w16sdtdh wp14">
+<w:footnotes xmlns:wpc="http://schemas.microsoft.com/office/word/2010/wordprocessingCanvas" xmlns:cx="http://schemas.microsoft.com/office/drawing/2014/chartex" xmlns:cx1="http://schemas.microsoft.com/office/drawing/2015/9/8/chartex" xmlns:cx2="http://schemas.microsoft.com/office/drawing/2015/10/21/chartex" xmlns:cx3="http://schemas.microsoft.com/office/drawing/2016/5/9/chartex" xmlns:cx4="http://schemas.microsoft.com/office/drawing/2016/5/10/chartex" xmlns:cx5="http://schemas.microsoft.com/office/drawing/2016/5/11/chartex" xmlns:cx6="http://schemas.microsoft.com/office/drawing/2016/5/12/chartex" xmlns:cx7="http://schemas.microsoft.com/office/drawing/2016/5/13/chartex" xmlns:cx8="http://schemas.microsoft.com/office/drawing/2016/5/14/chartex" xmlns:mc="http://schemas.openxmlformats.org/markup-compatibility/2006" xmlns:aink="http://schemas.microsoft.com/office/drawing/2016/ink" xmlns:am3d="http://schemas.microsoft.com/office/drawing/2017/model3d" xmlns:o="urn:schemas-microsoft-com:office:office" xmlns:oel="http://schemas.microsoft.com/office/2019/extlst" xmlns:r="http://schemas.openxmlformats.org/officeDocument/2006/relationships" xmlns:m="http://schemas.openxmlformats.org/officeDocument/2006/math" xmlns:v="urn:schemas-microsoft-com:vml" xmlns:wp14="http://schemas.microsoft.com/office/word/2010/wordprocessingDrawing" xmlns:wp="http://schemas.openxmlformats.org/drawingml/2006/wordprocessingDrawing" xmlns:w10="urn:schemas-microsoft-com:office:word" xmlns:w="http://schemas.openxmlformats.org/wordprocessingml/2006/main" xmlns:w14="http://schemas.microsoft.com/office/word/2010/wordml" xmlns:w15="http://schemas.microsoft.com/office/word/2012/wordml" xmlns:w16cex="http://schemas.microsoft.com/office/word/2018/wordml/cex" xmlns:w16cid="http://schemas.microsoft.com/office/word/2016/wordml/cid" xmlns:w16="http://schemas.microsoft.com/office/word/2018/wordml" xmlns:w16du="http://schemas.microsoft.com/office/word/2023/wordml/word16du" xmlns:w16sdtdh="http://schemas.microsoft.com/office/word/2020/wordml/sdtdatahash" xmlns:w16se="http://schemas.microsoft.com/office/word/2015/wordml/symex" xmlns:wpg="http://schemas.microsoft.com/office/word/2010/wordprocessingGroup" xmlns:wpi="http://schemas.microsoft.com/office/word/2010/wordprocessingInk" xmlns:wne="http://schemas.microsoft.com/office/word/2006/wordml" xmlns:wps="http://schemas.microsoft.com/office/word/2010/wordprocessingShape" mc:Ignorable="w14 w15 w16se w16cid w16 w16cex w16sdtdh wp14">
   <w:footnote w:type="separator" w:id="-1">
     <w:p>
       <w:pPr>

</xml_diff>

<commit_message>
[2026.04.30 hwan] deliverable 정리
</commit_message>
<xml_diff>
--- a/logmile_deliverable/straffic/주간보고/[KDT] 인천부평_3기_3조_1주차_주간보고서.docx
+++ b/logmile_deliverable/straffic/주간보고/[KDT] 인천부평_3기_3조_1주차_주간보고서.docx
@@ -169,7 +169,17 @@
           <w:sz w:val="20"/>
           <w:szCs w:val="20"/>
         </w:rPr>
-        <w:t xml:space="preserve"> 차량번호 인식 시스템 설계</w:t>
+        <w:t xml:space="preserve"> </w:t>
+      </w:r>
+      <w:r>
+        <w:rPr>
+          <w:rFonts w:hint="eastAsia"/>
+          <w:b/>
+          <w:bCs/>
+          <w:sz w:val="20"/>
+          <w:szCs w:val="20"/>
+        </w:rPr>
+        <w:t>운행 데이터 기반 화물차 운전자 피로도 실시간 모니터링 플랫폼</w:t>
       </w:r>
       <w:r>
         <w:rPr>
@@ -418,7 +428,6 @@
         <w:spacing w:after="0"/>
         <w:ind w:firstLineChars="100" w:firstLine="200"/>
         <w:rPr>
-          <w:rFonts w:hint="eastAsia"/>
           <w:sz w:val="20"/>
           <w:szCs w:val="20"/>
         </w:rPr>
@@ -446,7 +455,6 @@
         <w:spacing w:after="0"/>
         <w:ind w:firstLineChars="100" w:firstLine="200"/>
         <w:rPr>
-          <w:rFonts w:hint="eastAsia"/>
           <w:sz w:val="20"/>
           <w:szCs w:val="20"/>
         </w:rPr>
@@ -502,7 +510,6 @@
         <w:spacing w:after="0"/>
         <w:ind w:firstLineChars="100" w:firstLine="200"/>
         <w:rPr>
-          <w:rFonts w:hint="eastAsia"/>
           <w:sz w:val="20"/>
           <w:szCs w:val="20"/>
         </w:rPr>
@@ -606,7 +613,6 @@
         <w:spacing w:after="0"/>
         <w:ind w:firstLineChars="100" w:firstLine="200"/>
         <w:rPr>
-          <w:rFonts w:hint="eastAsia"/>
           <w:sz w:val="20"/>
           <w:szCs w:val="20"/>
         </w:rPr>
@@ -1023,6 +1029,40 @@
       <w:pPr>
         <w:wordWrap/>
         <w:spacing w:after="0"/>
+        <w:ind w:leftChars="100" w:left="1020" w:hangingChars="400" w:hanging="800"/>
+        <w:rPr>
+          <w:sz w:val="20"/>
+          <w:szCs w:val="20"/>
+        </w:rPr>
+      </w:pPr>
+      <w:r>
+        <w:rPr>
+          <w:rFonts w:hint="eastAsia"/>
+          <w:sz w:val="20"/>
+          <w:szCs w:val="20"/>
+        </w:rPr>
+        <w:t xml:space="preserve">    2-1) window11 - WSL2 + Docker Desktop 설치, JDK 21, IntelliJ IDEA (Spring Boot 백엔드), </w:t>
+      </w:r>
+      <w:r>
+        <w:rPr>
+          <w:sz w:val="20"/>
+          <w:szCs w:val="20"/>
+        </w:rPr>
+        <w:t xml:space="preserve">  </w:t>
+      </w:r>
+      <w:r>
+        <w:rPr>
+          <w:rFonts w:hint="eastAsia"/>
+          <w:sz w:val="20"/>
+          <w:szCs w:val="20"/>
+        </w:rPr>
+        <w:t>VS Code (Vue.js 프론트), Git, Python 3.11 (FastAPI/YOLOv8)</w:t>
+      </w:r>
+    </w:p>
+    <w:p>
+      <w:pPr>
+        <w:wordWrap/>
+        <w:spacing w:after="0"/>
         <w:ind w:firstLineChars="100" w:firstLine="200"/>
         <w:rPr>
           <w:sz w:val="20"/>
@@ -1031,56 +1071,44 @@
       </w:pPr>
       <w:r>
         <w:rPr>
-          <w:rFonts w:hint="eastAsia"/>
-          <w:sz w:val="20"/>
-          <w:szCs w:val="20"/>
-        </w:rPr>
-        <w:t xml:space="preserve">    2-1) window11 - WSL2 + Docker Desktop 설치, JDK 21, IntelliJ IDEA (Spring Boot 백엔드), VS Code (Vue.js 프론트), Git, Python 3.11 (FastAPI/YOLOv8)</w:t>
-      </w:r>
-      <w:r>
-        <w:rPr>
-          <w:sz w:val="20"/>
-          <w:szCs w:val="20"/>
-        </w:rPr>
-      </w:r>
-      <w:r>
-        <w:rPr>
-          <w:rFonts w:hint="eastAsia"/>
-          <w:sz w:val="20"/>
-          <w:szCs w:val="20"/>
-        </w:rPr>
-      </w:r>
-      <w:r>
-        <w:rPr>
-          <w:sz w:val="20"/>
-          <w:szCs w:val="20"/>
-        </w:rPr>
-      </w:r>
-      <w:r>
-        <w:rPr>
-          <w:rFonts w:hint="eastAsia"/>
-          <w:sz w:val="20"/>
-          <w:szCs w:val="20"/>
-        </w:rPr>
+          <w:sz w:val="20"/>
+          <w:szCs w:val="20"/>
+        </w:rPr>
+        <w:t xml:space="preserve">    2-2) Mac - Docker Desktop 설치, JDK 21, IntelliJ IDEA (Spring Boot </w:t>
+      </w:r>
+      <w:proofErr w:type="spellStart"/>
+      <w:r>
+        <w:rPr>
+          <w:sz w:val="20"/>
+          <w:szCs w:val="20"/>
+        </w:rPr>
+        <w:t>백엔드</w:t>
+      </w:r>
+      <w:proofErr w:type="spellEnd"/>
+      <w:r>
+        <w:rPr>
+          <w:sz w:val="20"/>
+          <w:szCs w:val="20"/>
+        </w:rPr>
+        <w:t xml:space="preserve">), </w:t>
       </w:r>
     </w:p>
     <w:p>
       <w:pPr>
         <w:wordWrap/>
         <w:spacing w:after="0"/>
-        <w:ind w:firstLineChars="100" w:firstLine="200"/>
-        <w:rPr>
-          <w:rFonts w:hint="eastAsia"/>
-          <w:sz w:val="20"/>
-          <w:szCs w:val="20"/>
-        </w:rPr>
-      </w:pPr>
-      <w:r>
-        <w:rPr>
-          <w:sz w:val="20"/>
-          <w:szCs w:val="20"/>
-        </w:rPr>
-        <w:t xml:space="preserve">    2-2) Mac - Docker Desktop 설치, JDK 21, IntelliJ IDEA (Spring Boot 백엔드), VS Code (Vue.js 프론트), Homebrew, Git, Python 3.11 (FastAPI/YOLOv8)</w:t>
+        <w:ind w:firstLineChars="500" w:firstLine="1000"/>
+        <w:rPr>
+          <w:sz w:val="20"/>
+          <w:szCs w:val="20"/>
+        </w:rPr>
+      </w:pPr>
+      <w:r>
+        <w:rPr>
+          <w:sz w:val="20"/>
+          <w:szCs w:val="20"/>
+        </w:rPr>
+        <w:t>VS Code (Vue.js 프론트), Homebrew, Git, Python 3.11 (FastAPI/YOLOv8)</w:t>
       </w:r>
     </w:p>
     <w:p>
@@ -1961,6 +1989,7 @@
                 <w:sz w:val="20"/>
                 <w:szCs w:val="20"/>
               </w:rPr>
+              <w:lastRenderedPageBreak/>
               <w:t>합계</w:t>
             </w:r>
           </w:p>
@@ -2061,7 +2090,6 @@
         <w:spacing w:after="0"/>
         <w:ind w:firstLineChars="100" w:firstLine="200"/>
         <w:rPr>
-          <w:rFonts w:hint="eastAsia"/>
           <w:sz w:val="20"/>
           <w:szCs w:val="20"/>
         </w:rPr>

</xml_diff>

<commit_message>
[2026.04.30 seo] deliverable 정리
</commit_message>
<xml_diff>
--- a/logmile_deliverable/straffic/주간보고/[KDT] 인천부평_3기_3조_1주차_주간보고서.docx
+++ b/logmile_deliverable/straffic/주간보고/[KDT] 인천부평_3기_3조_1주차_주간보고서.docx
@@ -169,7 +169,17 @@
           <w:sz w:val="20"/>
           <w:szCs w:val="20"/>
         </w:rPr>
-        <w:t xml:space="preserve"> 차량번호 인식 시스템 설계</w:t>
+        <w:t xml:space="preserve"> </w:t>
+      </w:r>
+      <w:r>
+        <w:rPr>
+          <w:rFonts w:hint="eastAsia"/>
+          <w:b/>
+          <w:bCs/>
+          <w:sz w:val="20"/>
+          <w:szCs w:val="20"/>
+        </w:rPr>
+        <w:t>운행 데이터 기반 화물차 운전자 피로도 실시간 모니터링 플랫폼</w:t>
       </w:r>
       <w:r>
         <w:rPr>
@@ -418,7 +428,6 @@
         <w:spacing w:after="0"/>
         <w:ind w:firstLineChars="100" w:firstLine="200"/>
         <w:rPr>
-          <w:rFonts w:hint="eastAsia"/>
           <w:sz w:val="20"/>
           <w:szCs w:val="20"/>
         </w:rPr>
@@ -446,7 +455,6 @@
         <w:spacing w:after="0"/>
         <w:ind w:firstLineChars="100" w:firstLine="200"/>
         <w:rPr>
-          <w:rFonts w:hint="eastAsia"/>
           <w:sz w:val="20"/>
           <w:szCs w:val="20"/>
         </w:rPr>
@@ -502,7 +510,6 @@
         <w:spacing w:after="0"/>
         <w:ind w:firstLineChars="100" w:firstLine="200"/>
         <w:rPr>
-          <w:rFonts w:hint="eastAsia"/>
           <w:sz w:val="20"/>
           <w:szCs w:val="20"/>
         </w:rPr>
@@ -606,7 +613,6 @@
         <w:spacing w:after="0"/>
         <w:ind w:firstLineChars="100" w:firstLine="200"/>
         <w:rPr>
-          <w:rFonts w:hint="eastAsia"/>
           <w:sz w:val="20"/>
           <w:szCs w:val="20"/>
         </w:rPr>
@@ -1023,6 +1029,40 @@
       <w:pPr>
         <w:wordWrap/>
         <w:spacing w:after="0"/>
+        <w:ind w:leftChars="100" w:left="1020" w:hangingChars="400" w:hanging="800"/>
+        <w:rPr>
+          <w:sz w:val="20"/>
+          <w:szCs w:val="20"/>
+        </w:rPr>
+      </w:pPr>
+      <w:r>
+        <w:rPr>
+          <w:rFonts w:hint="eastAsia"/>
+          <w:sz w:val="20"/>
+          <w:szCs w:val="20"/>
+        </w:rPr>
+        <w:t xml:space="preserve">    2-1) window11 - WSL2 + Docker Desktop 설치, JDK 21, IntelliJ IDEA (Spring Boot 백엔드), </w:t>
+      </w:r>
+      <w:r>
+        <w:rPr>
+          <w:sz w:val="20"/>
+          <w:szCs w:val="20"/>
+        </w:rPr>
+        <w:t xml:space="preserve">  </w:t>
+      </w:r>
+      <w:r>
+        <w:rPr>
+          <w:rFonts w:hint="eastAsia"/>
+          <w:sz w:val="20"/>
+          <w:szCs w:val="20"/>
+        </w:rPr>
+        <w:t>VS Code (Vue.js 프론트), Git, Python 3.11 (FastAPI/YOLOv8)</w:t>
+      </w:r>
+    </w:p>
+    <w:p>
+      <w:pPr>
+        <w:wordWrap/>
+        <w:spacing w:after="0"/>
         <w:ind w:firstLineChars="100" w:firstLine="200"/>
         <w:rPr>
           <w:sz w:val="20"/>
@@ -1031,56 +1071,44 @@
       </w:pPr>
       <w:r>
         <w:rPr>
-          <w:rFonts w:hint="eastAsia"/>
-          <w:sz w:val="20"/>
-          <w:szCs w:val="20"/>
-        </w:rPr>
-        <w:t xml:space="preserve">    2-1) window11 - WSL2 + Docker Desktop 설치, JDK 21, IntelliJ IDEA (Spring Boot 백엔드), VS Code (Vue.js 프론트), Git, Python 3.11 (FastAPI/YOLOv8)</w:t>
-      </w:r>
-      <w:r>
-        <w:rPr>
-          <w:sz w:val="20"/>
-          <w:szCs w:val="20"/>
-        </w:rPr>
-      </w:r>
-      <w:r>
-        <w:rPr>
-          <w:rFonts w:hint="eastAsia"/>
-          <w:sz w:val="20"/>
-          <w:szCs w:val="20"/>
-        </w:rPr>
-      </w:r>
-      <w:r>
-        <w:rPr>
-          <w:sz w:val="20"/>
-          <w:szCs w:val="20"/>
-        </w:rPr>
-      </w:r>
-      <w:r>
-        <w:rPr>
-          <w:rFonts w:hint="eastAsia"/>
-          <w:sz w:val="20"/>
-          <w:szCs w:val="20"/>
-        </w:rPr>
+          <w:sz w:val="20"/>
+          <w:szCs w:val="20"/>
+        </w:rPr>
+        <w:t xml:space="preserve">    2-2) Mac - Docker Desktop 설치, JDK 21, IntelliJ IDEA (Spring Boot </w:t>
+      </w:r>
+      <w:proofErr w:type="spellStart"/>
+      <w:r>
+        <w:rPr>
+          <w:sz w:val="20"/>
+          <w:szCs w:val="20"/>
+        </w:rPr>
+        <w:t>백엔드</w:t>
+      </w:r>
+      <w:proofErr w:type="spellEnd"/>
+      <w:r>
+        <w:rPr>
+          <w:sz w:val="20"/>
+          <w:szCs w:val="20"/>
+        </w:rPr>
+        <w:t xml:space="preserve">), </w:t>
       </w:r>
     </w:p>
     <w:p>
       <w:pPr>
         <w:wordWrap/>
         <w:spacing w:after="0"/>
-        <w:ind w:firstLineChars="100" w:firstLine="200"/>
-        <w:rPr>
-          <w:rFonts w:hint="eastAsia"/>
-          <w:sz w:val="20"/>
-          <w:szCs w:val="20"/>
-        </w:rPr>
-      </w:pPr>
-      <w:r>
-        <w:rPr>
-          <w:sz w:val="20"/>
-          <w:szCs w:val="20"/>
-        </w:rPr>
-        <w:t xml:space="preserve">    2-2) Mac - Docker Desktop 설치, JDK 21, IntelliJ IDEA (Spring Boot 백엔드), VS Code (Vue.js 프론트), Homebrew, Git, Python 3.11 (FastAPI/YOLOv8)</w:t>
+        <w:ind w:firstLineChars="500" w:firstLine="1000"/>
+        <w:rPr>
+          <w:sz w:val="20"/>
+          <w:szCs w:val="20"/>
+        </w:rPr>
+      </w:pPr>
+      <w:r>
+        <w:rPr>
+          <w:sz w:val="20"/>
+          <w:szCs w:val="20"/>
+        </w:rPr>
+        <w:t>VS Code (Vue.js 프론트), Homebrew, Git, Python 3.11 (FastAPI/YOLOv8)</w:t>
       </w:r>
     </w:p>
     <w:p>
@@ -1961,6 +1989,7 @@
                 <w:sz w:val="20"/>
                 <w:szCs w:val="20"/>
               </w:rPr>
+              <w:lastRenderedPageBreak/>
               <w:t>합계</w:t>
             </w:r>
           </w:p>
@@ -2061,7 +2090,6 @@
         <w:spacing w:after="0"/>
         <w:ind w:firstLineChars="100" w:firstLine="200"/>
         <w:rPr>
-          <w:rFonts w:hint="eastAsia"/>
           <w:sz w:val="20"/>
           <w:szCs w:val="20"/>
         </w:rPr>

</xml_diff>